<commit_message>
Update Git Cheat Sheet - Progressive Pull.docx
</commit_message>
<xml_diff>
--- a/Chapter4/Git Cheat Sheet - Progressive Pull.docx
+++ b/Chapter4/Git Cheat Sheet - Progressive Pull.docx
@@ -1,73 +1,40 @@
 
 <file path=word/document.xml><?xml version="1.0" encoding="utf-8"?>
-<w:document xmlns:wpc="http://schemas.microsoft.com/office/word/2010/wordprocessingCanvas" xmlns:cx="http://schemas.microsoft.com/office/drawing/2014/chartex" xmlns:cx1="http://schemas.microsoft.com/office/drawing/2015/9/8/chartex" xmlns:cx2="http://schemas.microsoft.com/office/drawing/2015/10/21/chartex" xmlns:cx3="http://schemas.microsoft.com/office/drawing/2016/5/9/chartex" xmlns:cx4="http://schemas.microsoft.com/office/drawing/2016/5/10/chartex" xmlns:cx5="http://schemas.microsoft.com/office/drawing/2016/5/11/chartex" xmlns:cx6="http://schemas.microsoft.com/office/drawing/2016/5/12/chartex" xmlns:cx7="http://schemas.microsoft.com/office/drawing/2016/5/13/chartex" xmlns:cx8="http://schemas.microsoft.com/office/drawing/2016/5/14/chartex" xmlns:mc="http://schemas.openxmlformats.org/markup-compatibility/2006" xmlns:aink="http://schemas.microsoft.com/office/drawing/2016/ink" xmlns:am3d="http://schemas.microsoft.com/office/drawing/2017/model3d" xmlns:o="urn:schemas-microsoft-com:office:office" xmlns:oel="http://schemas.microsoft.com/office/2019/extlst" xmlns:r="http://schemas.openxmlformats.org/officeDocument/2006/relationships" xmlns:m="http://schemas.openxmlformats.org/officeDocument/2006/math" xmlns:v="urn:schemas-microsoft-com:vml" xmlns:wp14="http://schemas.microsoft.com/office/word/2010/wordprocessingDrawing" xmlns:wp="http://schemas.openxmlformats.org/drawingml/2006/wordprocessingDrawing" xmlns:w10="urn:schemas-microsoft-com:office:word" xmlns:w="http://schemas.openxmlformats.org/wordprocessingml/2006/main" xmlns:w14="http://schemas.microsoft.com/office/word/2010/wordml" xmlns:w15="http://schemas.microsoft.com/office/word/2012/wordml" xmlns:w16cex="http://schemas.microsoft.com/office/word/2018/wordml/cex" xmlns:w16cid="http://schemas.microsoft.com/office/word/2016/wordml/cid" xmlns:w16="http://schemas.microsoft.com/office/word/2018/wordml" xmlns:w16du="http://schemas.microsoft.com/office/word/2023/wordml/word16du" xmlns:w16sdtdh="http://schemas.microsoft.com/office/word/2020/wordml/sdtdatahash" xmlns:w16se="http://schemas.microsoft.com/office/word/2015/wordml/symex" xmlns:wpg="http://schemas.microsoft.com/office/word/2010/wordprocessingGroup" xmlns:wpi="http://schemas.microsoft.com/office/word/2010/wordprocessingInk" xmlns:wne="http://schemas.microsoft.com/office/word/2006/wordml" xmlns:wps="http://schemas.microsoft.com/office/word/2010/wordprocessingShape" xmlns:a="http://schemas.openxmlformats.org/drawingml/2006/main" xmlns:pic="http://schemas.openxmlformats.org/drawingml/2006/picture" xmlns:a14="http://schemas.microsoft.com/office/drawing/2010/main" mc:Ignorable="w14 w15 w16se w16cid w16 w16cex w16sdtdh w16du wp14">
+<w:document xmlns:wpc="http://schemas.microsoft.com/office/word/2010/wordprocessingCanvas" xmlns:cx="http://schemas.microsoft.com/office/drawing/2014/chartex" xmlns:cx1="http://schemas.microsoft.com/office/drawing/2015/9/8/chartex" xmlns:cx2="http://schemas.microsoft.com/office/drawing/2015/10/21/chartex" xmlns:cx3="http://schemas.microsoft.com/office/drawing/2016/5/9/chartex" xmlns:cx4="http://schemas.microsoft.com/office/drawing/2016/5/10/chartex" xmlns:cx5="http://schemas.microsoft.com/office/drawing/2016/5/11/chartex" xmlns:cx6="http://schemas.microsoft.com/office/drawing/2016/5/12/chartex" xmlns:cx7="http://schemas.microsoft.com/office/drawing/2016/5/13/chartex" xmlns:cx8="http://schemas.microsoft.com/office/drawing/2016/5/14/chartex" xmlns:mc="http://schemas.openxmlformats.org/markup-compatibility/2006" xmlns:aink="http://schemas.microsoft.com/office/drawing/2016/ink" xmlns:am3d="http://schemas.microsoft.com/office/drawing/2017/model3d" xmlns:o="urn:schemas-microsoft-com:office:office" xmlns:oel="http://schemas.microsoft.com/office/2019/extlst" xmlns:r="http://schemas.openxmlformats.org/officeDocument/2006/relationships" xmlns:m="http://schemas.openxmlformats.org/officeDocument/2006/math" xmlns:v="urn:schemas-microsoft-com:vml" xmlns:wp14="http://schemas.microsoft.com/office/word/2010/wordprocessingDrawing" xmlns:wp="http://schemas.openxmlformats.org/drawingml/2006/wordprocessingDrawing" xmlns:w10="urn:schemas-microsoft-com:office:word" xmlns:w="http://schemas.openxmlformats.org/wordprocessingml/2006/main" xmlns:w14="http://schemas.microsoft.com/office/word/2010/wordml" xmlns:w15="http://schemas.microsoft.com/office/word/2012/wordml" xmlns:w16cex="http://schemas.microsoft.com/office/word/2018/wordml/cex" xmlns:w16cid="http://schemas.microsoft.com/office/word/2016/wordml/cid" xmlns:w16="http://schemas.microsoft.com/office/word/2018/wordml" xmlns:w16du="http://schemas.microsoft.com/office/word/2023/wordml/word16du" xmlns:w16sdtdh="http://schemas.microsoft.com/office/word/2020/wordml/sdtdatahash" xmlns:w16se="http://schemas.microsoft.com/office/word/2015/wordml/symex" xmlns:wpg="http://schemas.microsoft.com/office/word/2010/wordprocessingGroup" xmlns:wpi="http://schemas.microsoft.com/office/word/2010/wordprocessingInk" xmlns:wne="http://schemas.microsoft.com/office/word/2006/wordml" xmlns:wps="http://schemas.microsoft.com/office/word/2010/wordprocessingShape" mc:Ignorable="w14 w15 w16se w16cid w16 w16cex w16sdtdh w16du wp14">
   <w:body>
     <w:p>
       <w:pPr>
         <w:pStyle w:val="Heading1"/>
-        <w:rPr>
-          <w:noProof w:val="0"/>
-          <w:lang w:val="en-US"/>
-        </w:rPr>
-      </w:pPr>
-      <w:bookmarkStart w:name="_Int_ADf5FhAE" w:id="410547747"/>
-      <w:r>
-        <w:rPr>
-          <w:noProof w:val="0"/>
-          <w:lang w:val="en-US"/>
-        </w:rPr>
+      </w:pPr>
+      <w:bookmarkStart w:id="0" w:name="_Int_ADf5FhAE"/>
+      <w:r>
         <w:t>H</w:t>
       </w:r>
       <w:r>
-        <w:rPr>
-          <w:noProof w:val="0"/>
-          <w:lang w:val="en-US"/>
-        </w:rPr>
         <w:t xml:space="preserve">ow to </w:t>
       </w:r>
       <w:r>
-        <w:rPr>
-          <w:noProof w:val="0"/>
-          <w:lang w:val="en-US"/>
-        </w:rPr>
         <w:t>R</w:t>
       </w:r>
       <w:r>
-        <w:rPr>
-          <w:noProof w:val="0"/>
-          <w:lang w:val="en-US"/>
-        </w:rPr>
         <w:t xml:space="preserve">ename and </w:t>
       </w:r>
       <w:r>
-        <w:rPr>
-          <w:noProof w:val="0"/>
-          <w:lang w:val="en-US"/>
-        </w:rPr>
         <w:t>R</w:t>
       </w:r>
       <w:r>
-        <w:rPr>
-          <w:noProof w:val="0"/>
-          <w:lang w:val="en-US"/>
-        </w:rPr>
         <w:t>emove file</w:t>
       </w:r>
-      <w:bookmarkEnd w:id="410547747"/>
+      <w:bookmarkEnd w:id="0"/>
     </w:p>
     <w:p/>
     <w:p>
       <w:r>
-        <w:rPr/>
         <w:t>Git makes renaming and removing files a breeze. For renaming, it's a simple two-step process:</w:t>
       </w:r>
     </w:p>
     <w:p>
-      <w:pPr>
-        <w:pStyle w:val="Normal"/>
-      </w:pPr>
-      <w:r>
-        <w:rPr/>
+      <w:r>
         <w:t xml:space="preserve"> </w:t>
       </w:r>
     </w:p>
@@ -76,36 +43,36 @@
         <w:pStyle w:val="ListParagraph"/>
         <w:numPr>
           <w:ilvl w:val="0"/>
-          <w:numId w:val="8"/>
+          <w:numId w:val="3"/>
         </w:numPr>
-        <w:rPr/>
-      </w:pPr>
-      <w:r>
-        <w:rPr/>
+      </w:pPr>
+      <w:r>
         <w:t xml:space="preserve">Use </w:t>
       </w:r>
       <w:r>
         <w:rPr>
-          <w:b w:val="1"/>
-          <w:bCs w:val="1"/>
+          <w:b/>
+          <w:bCs/>
           <w:color w:val="FF0000"/>
         </w:rPr>
         <w:t xml:space="preserve">git mv </w:t>
       </w:r>
       <w:proofErr w:type="spellStart"/>
+      <w:proofErr w:type="gramStart"/>
       <w:r>
         <w:rPr>
-          <w:b w:val="1"/>
-          <w:bCs w:val="1"/>
+          <w:b/>
+          <w:bCs/>
           <w:color w:val="FF0000"/>
         </w:rPr>
         <w:t>oldfilename</w:t>
       </w:r>
       <w:proofErr w:type="spellEnd"/>
+      <w:proofErr w:type="gramEnd"/>
       <w:r>
         <w:rPr>
-          <w:b w:val="1"/>
-          <w:bCs w:val="1"/>
+          <w:b/>
+          <w:bCs/>
           <w:color w:val="FF0000"/>
         </w:rPr>
         <w:t xml:space="preserve"> </w:t>
@@ -113,8 +80,8 @@
       <w:proofErr w:type="spellStart"/>
       <w:r>
         <w:rPr>
-          <w:b w:val="1"/>
-          <w:bCs w:val="1"/>
+          <w:b/>
+          <w:bCs/>
           <w:color w:val="FF0000"/>
         </w:rPr>
         <w:t>newfilename</w:t>
@@ -122,14 +89,13 @@
       <w:proofErr w:type="spellEnd"/>
       <w:r>
         <w:rPr>
-          <w:b w:val="1"/>
-          <w:bCs w:val="1"/>
+          <w:b/>
+          <w:bCs/>
           <w:color w:val="FF0000"/>
         </w:rPr>
         <w:t xml:space="preserve"> </w:t>
       </w:r>
       <w:r>
-        <w:rPr/>
         <w:t>to rename the file. This tells Git about the change.</w:t>
       </w:r>
     </w:p>
@@ -138,51 +104,36 @@
         <w:pStyle w:val="ListParagraph"/>
         <w:numPr>
           <w:ilvl w:val="0"/>
-          <w:numId w:val="8"/>
+          <w:numId w:val="3"/>
         </w:numPr>
-        <w:rPr/>
-      </w:pPr>
-      <w:r>
-        <w:rPr/>
+      </w:pPr>
+      <w:r>
         <w:t xml:space="preserve">Commit the change with </w:t>
       </w:r>
       <w:r>
         <w:rPr>
-          <w:b w:val="1"/>
-          <w:bCs w:val="1"/>
+          <w:b/>
+          <w:bCs/>
           <w:color w:val="FF0000"/>
         </w:rPr>
         <w:t>git commit -m "Renamed file"</w:t>
       </w:r>
       <w:r>
-        <w:rPr/>
         <w:t>.</w:t>
       </w:r>
     </w:p>
     <w:p>
-      <w:pPr>
-        <w:pStyle w:val="Normal"/>
-      </w:pPr>
-      <w:r>
-        <w:rPr/>
+      <w:r>
         <w:t xml:space="preserve"> </w:t>
       </w:r>
     </w:p>
     <w:p>
-      <w:pPr>
-        <w:pStyle w:val="Normal"/>
-      </w:pPr>
-      <w:r>
-        <w:rPr/>
+      <w:r>
         <w:t>For removing a file:</w:t>
       </w:r>
     </w:p>
     <w:p>
-      <w:pPr>
-        <w:pStyle w:val="Normal"/>
-      </w:pPr>
-      <w:r>
-        <w:rPr/>
+      <w:r>
         <w:t xml:space="preserve"> </w:t>
       </w:r>
     </w:p>
@@ -191,24 +142,42 @@
         <w:pStyle w:val="ListParagraph"/>
         <w:numPr>
           <w:ilvl w:val="0"/>
-          <w:numId w:val="10"/>
+          <w:numId w:val="1"/>
         </w:numPr>
-        <w:rPr/>
-      </w:pPr>
-      <w:r>
-        <w:rPr/>
-        <w:t xml:space="preserve">Use </w:t>
+      </w:pPr>
+      <w:r>
+        <w:t>Use</w:t>
+      </w:r>
+      <w:r>
+        <w:t xml:space="preserve"> </w:t>
+      </w:r>
+      <w:r>
+        <w:t>the</w:t>
       </w:r>
       <w:r>
         <w:rPr>
-          <w:b w:val="1"/>
-          <w:bCs w:val="1"/>
+          <w:b/>
+          <w:bCs/>
+        </w:rPr>
+        <w:t xml:space="preserve"> </w:t>
+      </w:r>
+      <w:r>
+        <w:rPr>
+          <w:b/>
+          <w:bCs/>
           <w:color w:val="FF0000"/>
         </w:rPr>
-        <w:t>git rm filename</w:t>
-      </w:r>
-      <w:r>
-        <w:rPr/>
+        <w:t>git</w:t>
+      </w:r>
+      <w:r>
+        <w:rPr>
+          <w:b/>
+          <w:bCs/>
+          <w:color w:val="FF0000"/>
+        </w:rPr>
+        <w:t xml:space="preserve"> rm filename</w:t>
+      </w:r>
+      <w:r>
         <w:t xml:space="preserve"> to delete the file.</w:t>
       </w:r>
     </w:p>
@@ -217,85 +186,64 @@
         <w:pStyle w:val="ListParagraph"/>
         <w:numPr>
           <w:ilvl w:val="0"/>
-          <w:numId w:val="10"/>
+          <w:numId w:val="1"/>
         </w:numPr>
-        <w:rPr/>
-      </w:pPr>
-      <w:r>
-        <w:rPr/>
+      </w:pPr>
+      <w:r>
         <w:t xml:space="preserve">Commit the removal with </w:t>
       </w:r>
       <w:r>
         <w:rPr>
-          <w:b w:val="1"/>
-          <w:bCs w:val="1"/>
+          <w:b/>
+          <w:bCs/>
           <w:color w:val="FF0000"/>
         </w:rPr>
         <w:t>git commit -m "Removed file"</w:t>
       </w:r>
       <w:r>
-        <w:rPr/>
         <w:t>.</w:t>
       </w:r>
     </w:p>
-    <w:p>
-      <w:pPr>
-        <w:pStyle w:val="Normal"/>
-      </w:pPr>
-    </w:p>
+    <w:p/>
     <w:p>
       <w:pPr>
         <w:pStyle w:val="Heading1"/>
         <w:rPr>
-          <w:rFonts w:ascii="Aptos" w:hAnsi="Aptos" w:eastAsia="Aptos" w:cs="Aptos"/>
-          <w:noProof w:val="0"/>
+          <w:rFonts w:ascii="Aptos" w:eastAsia="Aptos" w:hAnsi="Aptos" w:cs="Aptos"/>
           <w:sz w:val="24"/>
           <w:szCs w:val="24"/>
-          <w:lang w:val="en-US"/>
         </w:rPr>
       </w:pPr>
       <w:r>
+        <w:t>How to skip staging code just commit</w:t>
+      </w:r>
+    </w:p>
+    <w:p/>
+    <w:p>
+      <w:r>
         <w:rPr>
-          <w:noProof w:val="0"/>
-          <w:lang w:val="en-US"/>
+          <w:noProof/>
         </w:rPr>
-        <w:t>How to skip staging code just commit</w:t>
-      </w:r>
-    </w:p>
-    <w:p>
-      <w:pPr>
-        <w:pStyle w:val="Normal"/>
-        <w:rPr>
-          <w:noProof w:val="0"/>
-          <w:lang w:val="en-US"/>
-        </w:rPr>
-      </w:pPr>
-    </w:p>
-    <w:p>
-      <w:pPr>
-        <w:pStyle w:val="Normal"/>
-      </w:pPr>
-      <w:r>
         <w:drawing>
-          <wp:inline wp14:editId="548F4EAB" wp14:anchorId="0E8BF7FF">
+          <wp:inline distT="0" distB="0" distL="0" distR="0" wp14:anchorId="0E8BF7FF" wp14:editId="548F4EAB">
             <wp:extent cx="5943600" cy="1962150"/>
             <wp:effectExtent l="0" t="0" r="0" b="0"/>
-            <wp:docPr id="1864928516" name="" title=""/>
+            <wp:docPr id="1864928516" name="Picture 1864928516"/>
             <wp:cNvGraphicFramePr>
-              <a:graphicFrameLocks noChangeAspect="1"/>
+              <a:graphicFrameLocks xmlns:a="http://schemas.openxmlformats.org/drawingml/2006/main" noChangeAspect="1"/>
             </wp:cNvGraphicFramePr>
-            <a:graphic>
+            <a:graphic xmlns:a="http://schemas.openxmlformats.org/drawingml/2006/main">
               <a:graphicData uri="http://schemas.openxmlformats.org/drawingml/2006/picture">
-                <pic:pic>
+                <pic:pic xmlns:pic="http://schemas.openxmlformats.org/drawingml/2006/picture">
                   <pic:nvPicPr>
                     <pic:cNvPr id="0" name=""/>
                     <pic:cNvPicPr/>
                   </pic:nvPicPr>
                   <pic:blipFill>
-                    <a:blip r:embed="Rd59d63736aed4417">
+                    <a:blip r:embed="rId5">
                       <a:extLst>
-                        <a:ext xmlns:a="http://schemas.openxmlformats.org/drawingml/2006/main" uri="{28A0092B-C50C-407E-A947-70E740481C1C}">
-                          <a14:useLocalDpi val="0"/>
+                        <a:ext uri="{28A0092B-C50C-407E-A947-70E740481C1C}">
+                          <a14:useLocalDpi xmlns:a14="http://schemas.microsoft.com/office/drawing/2010/main" val="0"/>
                         </a:ext>
                       </a:extLst>
                     </a:blip>
@@ -324,45 +272,60 @@
         <w:pStyle w:val="Heading1"/>
       </w:pPr>
       <w:r>
-        <w:rPr>
-          <w:noProof w:val="0"/>
-          <w:lang w:val="en-US"/>
-        </w:rPr>
         <w:t>ls-files</w:t>
       </w:r>
     </w:p>
     <w:p/>
     <w:p>
       <w:r>
-        <w:rPr/>
+        <w:lastRenderedPageBreak/>
         <w:t xml:space="preserve">Git ls-files is like Git's inventory checker. It </w:t>
       </w:r>
       <w:r>
         <w:rPr>
-          <w:b w:val="1"/>
-          <w:bCs w:val="1"/>
+          <w:b/>
+          <w:bCs/>
         </w:rPr>
         <w:t>shows you a list of files in your repository that Git knows about.</w:t>
       </w:r>
       <w:r>
-        <w:rPr/>
-        <w:t xml:space="preserve"> This includes tracked files, which means files that are part of your Git history, and optionally, files that would be excluded by </w:t>
+        <w:t xml:space="preserve"> This includes tracked files, which means files that are part of your Git history, and optionally, files that would be excluded </w:t>
+      </w:r>
+      <w:proofErr w:type="gramStart"/>
+      <w:r>
+        <w:t xml:space="preserve">by </w:t>
       </w:r>
       <w:r>
         <w:rPr>
-          <w:b w:val="1"/>
-          <w:bCs w:val="1"/>
+          <w:b/>
+          <w:bCs/>
           <w:color w:val="FF0000"/>
         </w:rPr>
-        <w:t>.gitignore</w:t>
-      </w:r>
-      <w:r>
-        <w:rPr/>
-        <w:t>. It's super handy for getting a quick overview of what's in your repo.</w:t>
+        <w:t>.</w:t>
+      </w:r>
+      <w:proofErr w:type="spellStart"/>
+      <w:r>
+        <w:rPr>
+          <w:b/>
+          <w:bCs/>
+          <w:color w:val="FF0000"/>
+        </w:rPr>
+        <w:t>gitignore</w:t>
+      </w:r>
+      <w:proofErr w:type="spellEnd"/>
+      <w:proofErr w:type="gramEnd"/>
+      <w:r>
+        <w:t xml:space="preserve">. It's super handy </w:t>
+      </w:r>
+      <w:r>
+        <w:t>to get</w:t>
+      </w:r>
+      <w:r>
+        <w:t xml:space="preserve"> a quick overview of what's in your repo.</w:t>
       </w:r>
     </w:p>
     <w:sectPr>
-      <w:pgSz w:w="12240" w:h="15840" w:orient="portrait"/>
+      <w:pgSz w:w="12240" w:h="15840"/>
       <w:pgMar w:top="1440" w:right="1440" w:bottom="1440" w:left="1440" w:header="720" w:footer="720" w:gutter="0"/>
       <w:cols w:space="720"/>
       <w:docGrid w:linePitch="360"/>
@@ -372,22 +335,24 @@
 </file>
 
 <file path=word/intelligence2.xml><?xml version="1.0" encoding="utf-8"?>
-<int2:intelligence xmlns:int2="http://schemas.microsoft.com/office/intelligence/2020/intelligence">
+<int2:intelligence xmlns:int2="http://schemas.microsoft.com/office/intelligence/2020/intelligence" xmlns:oel="http://schemas.microsoft.com/office/2019/extlst">
   <int2:observations>
     <int2:bookmark int2:bookmarkName="_Int_ADf5FhAE" int2:invalidationBookmarkName="" int2:hashCode="wmSmr5OXTerbWT" int2:id="TXvLq0r7">
-      <int2:state int2:type="WordDesignerSuggestedImageAnnotation" int2:value="Reviewed"/>
+      <int2:state int2:value="Reviewed" int2:type="WordDesignerSuggestedImageAnnotation"/>
     </int2:bookmark>
   </int2:observations>
   <int2:intelligenceSettings/>
+  <int2:onDemandWorkflows/>
 </int2:intelligence>
 </file>
 
 <file path=word/numbering.xml><?xml version="1.0" encoding="utf-8"?>
-<w:numbering xmlns:w="http://schemas.openxmlformats.org/wordprocessingml/2006/main">
-  <w:abstractNum xmlns:w="http://schemas.openxmlformats.org/wordprocessingml/2006/main" w:abstractNumId="10">
-    <w:nsid w:val="d27fb81"/>
-    <w:multiLevelType xmlns:w="http://schemas.openxmlformats.org/wordprocessingml/2006/main" w:val="hybridMultilevel"/>
-    <w:lvl xmlns:w="http://schemas.openxmlformats.org/wordprocessingml/2006/main" w:ilvl="0">
+<w:numbering xmlns:wpc="http://schemas.microsoft.com/office/word/2010/wordprocessingCanvas" xmlns:cx="http://schemas.microsoft.com/office/drawing/2014/chartex" xmlns:cx1="http://schemas.microsoft.com/office/drawing/2015/9/8/chartex" xmlns:cx2="http://schemas.microsoft.com/office/drawing/2015/10/21/chartex" xmlns:cx3="http://schemas.microsoft.com/office/drawing/2016/5/9/chartex" xmlns:cx4="http://schemas.microsoft.com/office/drawing/2016/5/10/chartex" xmlns:cx5="http://schemas.microsoft.com/office/drawing/2016/5/11/chartex" xmlns:cx6="http://schemas.microsoft.com/office/drawing/2016/5/12/chartex" xmlns:cx7="http://schemas.microsoft.com/office/drawing/2016/5/13/chartex" xmlns:cx8="http://schemas.microsoft.com/office/drawing/2016/5/14/chartex" xmlns:mc="http://schemas.openxmlformats.org/markup-compatibility/2006" xmlns:aink="http://schemas.microsoft.com/office/drawing/2016/ink" xmlns:am3d="http://schemas.microsoft.com/office/drawing/2017/model3d" xmlns:o="urn:schemas-microsoft-com:office:office" xmlns:oel="http://schemas.microsoft.com/office/2019/extlst" xmlns:r="http://schemas.openxmlformats.org/officeDocument/2006/relationships" xmlns:m="http://schemas.openxmlformats.org/officeDocument/2006/math" xmlns:v="urn:schemas-microsoft-com:vml" xmlns:wp14="http://schemas.microsoft.com/office/word/2010/wordprocessingDrawing" xmlns:wp="http://schemas.openxmlformats.org/drawingml/2006/wordprocessingDrawing" xmlns:w10="urn:schemas-microsoft-com:office:word" xmlns:w="http://schemas.openxmlformats.org/wordprocessingml/2006/main" xmlns:w14="http://schemas.microsoft.com/office/word/2010/wordml" xmlns:w15="http://schemas.microsoft.com/office/word/2012/wordml" xmlns:w16cex="http://schemas.microsoft.com/office/word/2018/wordml/cex" xmlns:w16cid="http://schemas.microsoft.com/office/word/2016/wordml/cid" xmlns:w16="http://schemas.microsoft.com/office/word/2018/wordml" xmlns:w16du="http://schemas.microsoft.com/office/word/2023/wordml/word16du" xmlns:w16sdtdh="http://schemas.microsoft.com/office/word/2020/wordml/sdtdatahash" xmlns:w16se="http://schemas.microsoft.com/office/word/2015/wordml/symex" xmlns:wpg="http://schemas.microsoft.com/office/word/2010/wordprocessingGroup" xmlns:wpi="http://schemas.microsoft.com/office/word/2010/wordprocessingInk" xmlns:wne="http://schemas.microsoft.com/office/word/2006/wordml" xmlns:wps="http://schemas.microsoft.com/office/word/2010/wordprocessingShape" mc:Ignorable="w14 w15 w16se w16cid w16 w16cex w16sdtdh w16du wp14">
+  <w:abstractNum w:abstractNumId="0" w15:restartNumberingAfterBreak="0">
+    <w:nsid w:val="0D27FB81"/>
+    <w:multiLevelType w:val="hybridMultilevel"/>
+    <w:tmpl w:val="17207C0E"/>
+    <w:lvl w:ilvl="0" w:tplc="806C17E4">
       <w:start w:val="1"/>
       <w:numFmt w:val="decimal"/>
       <w:lvlText w:val="%1."/>
@@ -396,7 +361,7 @@
         <w:ind w:left="720" w:hanging="360"/>
       </w:pPr>
     </w:lvl>
-    <w:lvl xmlns:w="http://schemas.openxmlformats.org/wordprocessingml/2006/main" w:ilvl="1">
+    <w:lvl w:ilvl="1" w:tplc="EC66ACD4">
       <w:start w:val="1"/>
       <w:numFmt w:val="lowerLetter"/>
       <w:lvlText w:val="%2."/>
@@ -405,7 +370,7 @@
         <w:ind w:left="1440" w:hanging="360"/>
       </w:pPr>
     </w:lvl>
-    <w:lvl xmlns:w="http://schemas.openxmlformats.org/wordprocessingml/2006/main" w:ilvl="2">
+    <w:lvl w:ilvl="2" w:tplc="C25A919A">
       <w:start w:val="1"/>
       <w:numFmt w:val="lowerRoman"/>
       <w:lvlText w:val="%3."/>
@@ -414,7 +379,7 @@
         <w:ind w:left="2160" w:hanging="180"/>
       </w:pPr>
     </w:lvl>
-    <w:lvl xmlns:w="http://schemas.openxmlformats.org/wordprocessingml/2006/main" w:ilvl="3">
+    <w:lvl w:ilvl="3" w:tplc="6AE8AB7A">
       <w:start w:val="1"/>
       <w:numFmt w:val="decimal"/>
       <w:lvlText w:val="%4."/>
@@ -423,7 +388,7 @@
         <w:ind w:left="2880" w:hanging="360"/>
       </w:pPr>
     </w:lvl>
-    <w:lvl xmlns:w="http://schemas.openxmlformats.org/wordprocessingml/2006/main" w:ilvl="4">
+    <w:lvl w:ilvl="4" w:tplc="009A9374">
       <w:start w:val="1"/>
       <w:numFmt w:val="lowerLetter"/>
       <w:lvlText w:val="%5."/>
@@ -432,7 +397,7 @@
         <w:ind w:left="3600" w:hanging="360"/>
       </w:pPr>
     </w:lvl>
-    <w:lvl xmlns:w="http://schemas.openxmlformats.org/wordprocessingml/2006/main" w:ilvl="5">
+    <w:lvl w:ilvl="5" w:tplc="6E8C894E">
       <w:start w:val="1"/>
       <w:numFmt w:val="lowerRoman"/>
       <w:lvlText w:val="%6."/>
@@ -441,7 +406,7 @@
         <w:ind w:left="4320" w:hanging="180"/>
       </w:pPr>
     </w:lvl>
-    <w:lvl xmlns:w="http://schemas.openxmlformats.org/wordprocessingml/2006/main" w:ilvl="6">
+    <w:lvl w:ilvl="6" w:tplc="F46C7DB4">
       <w:start w:val="1"/>
       <w:numFmt w:val="decimal"/>
       <w:lvlText w:val="%7."/>
@@ -450,7 +415,7 @@
         <w:ind w:left="5040" w:hanging="360"/>
       </w:pPr>
     </w:lvl>
-    <w:lvl xmlns:w="http://schemas.openxmlformats.org/wordprocessingml/2006/main" w:ilvl="7">
+    <w:lvl w:ilvl="7" w:tplc="F822F72E">
       <w:start w:val="1"/>
       <w:numFmt w:val="lowerLetter"/>
       <w:lvlText w:val="%8."/>
@@ -459,7 +424,7 @@
         <w:ind w:left="5760" w:hanging="360"/>
       </w:pPr>
     </w:lvl>
-    <w:lvl xmlns:w="http://schemas.openxmlformats.org/wordprocessingml/2006/main" w:ilvl="8">
+    <w:lvl w:ilvl="8" w:tplc="59F22B4A">
       <w:start w:val="1"/>
       <w:numFmt w:val="lowerRoman"/>
       <w:lvlText w:val="%9."/>
@@ -469,10 +434,11 @@
       </w:pPr>
     </w:lvl>
   </w:abstractNum>
-  <w:abstractNum xmlns:w="http://schemas.openxmlformats.org/wordprocessingml/2006/main" w:abstractNumId="9">
-    <w:nsid w:val="68efd58d"/>
-    <w:multiLevelType xmlns:w="http://schemas.openxmlformats.org/wordprocessingml/2006/main" w:val="hybridMultilevel"/>
-    <w:lvl xmlns:w="http://schemas.openxmlformats.org/wordprocessingml/2006/main" w:ilvl="0">
+  <w:abstractNum w:abstractNumId="1" w15:restartNumberingAfterBreak="0">
+    <w:nsid w:val="1D52B01A"/>
+    <w:multiLevelType w:val="hybridMultilevel"/>
+    <w:tmpl w:val="FE8CC3AC"/>
+    <w:lvl w:ilvl="0" w:tplc="2ADEF484">
       <w:start w:val="1"/>
       <w:numFmt w:val="decimal"/>
       <w:lvlText w:val="%1."/>
@@ -481,7 +447,7 @@
         <w:ind w:left="720" w:hanging="360"/>
       </w:pPr>
     </w:lvl>
-    <w:lvl xmlns:w="http://schemas.openxmlformats.org/wordprocessingml/2006/main" w:ilvl="1">
+    <w:lvl w:ilvl="1" w:tplc="F1BA2C10">
       <w:start w:val="1"/>
       <w:numFmt w:val="lowerLetter"/>
       <w:lvlText w:val="%2."/>
@@ -490,7 +456,7 @@
         <w:ind w:left="1440" w:hanging="360"/>
       </w:pPr>
     </w:lvl>
-    <w:lvl xmlns:w="http://schemas.openxmlformats.org/wordprocessingml/2006/main" w:ilvl="2">
+    <w:lvl w:ilvl="2" w:tplc="EA2ADC48">
       <w:start w:val="1"/>
       <w:numFmt w:val="lowerRoman"/>
       <w:lvlText w:val="%3."/>
@@ -499,7 +465,7 @@
         <w:ind w:left="2160" w:hanging="180"/>
       </w:pPr>
     </w:lvl>
-    <w:lvl xmlns:w="http://schemas.openxmlformats.org/wordprocessingml/2006/main" w:ilvl="3">
+    <w:lvl w:ilvl="3" w:tplc="65C21E16">
       <w:start w:val="1"/>
       <w:numFmt w:val="decimal"/>
       <w:lvlText w:val="%4."/>
@@ -508,7 +474,7 @@
         <w:ind w:left="2880" w:hanging="360"/>
       </w:pPr>
     </w:lvl>
-    <w:lvl xmlns:w="http://schemas.openxmlformats.org/wordprocessingml/2006/main" w:ilvl="4">
+    <w:lvl w:ilvl="4" w:tplc="BD72708A">
       <w:start w:val="1"/>
       <w:numFmt w:val="lowerLetter"/>
       <w:lvlText w:val="%5."/>
@@ -517,7 +483,7 @@
         <w:ind w:left="3600" w:hanging="360"/>
       </w:pPr>
     </w:lvl>
-    <w:lvl xmlns:w="http://schemas.openxmlformats.org/wordprocessingml/2006/main" w:ilvl="5">
+    <w:lvl w:ilvl="5" w:tplc="B6AEAD4C">
       <w:start w:val="1"/>
       <w:numFmt w:val="lowerRoman"/>
       <w:lvlText w:val="%6."/>
@@ -526,7 +492,7 @@
         <w:ind w:left="4320" w:hanging="180"/>
       </w:pPr>
     </w:lvl>
-    <w:lvl xmlns:w="http://schemas.openxmlformats.org/wordprocessingml/2006/main" w:ilvl="6">
+    <w:lvl w:ilvl="6" w:tplc="BF6E8212">
       <w:start w:val="1"/>
       <w:numFmt w:val="decimal"/>
       <w:lvlText w:val="%7."/>
@@ -535,7 +501,7 @@
         <w:ind w:left="5040" w:hanging="360"/>
       </w:pPr>
     </w:lvl>
-    <w:lvl xmlns:w="http://schemas.openxmlformats.org/wordprocessingml/2006/main" w:ilvl="7">
+    <w:lvl w:ilvl="7" w:tplc="49E4191E">
       <w:start w:val="1"/>
       <w:numFmt w:val="lowerLetter"/>
       <w:lvlText w:val="%8."/>
@@ -544,7 +510,7 @@
         <w:ind w:left="5760" w:hanging="360"/>
       </w:pPr>
     </w:lvl>
-    <w:lvl xmlns:w="http://schemas.openxmlformats.org/wordprocessingml/2006/main" w:ilvl="8">
+    <w:lvl w:ilvl="8" w:tplc="EB6E8ED4">
       <w:start w:val="1"/>
       <w:numFmt w:val="lowerRoman"/>
       <w:lvlText w:val="%9."/>
@@ -554,10 +520,11 @@
       </w:pPr>
     </w:lvl>
   </w:abstractNum>
-  <w:abstractNum xmlns:w="http://schemas.openxmlformats.org/wordprocessingml/2006/main" w:abstractNumId="8">
-    <w:nsid w:val="1e172895"/>
-    <w:multiLevelType xmlns:w="http://schemas.openxmlformats.org/wordprocessingml/2006/main" w:val="hybridMultilevel"/>
-    <w:lvl xmlns:w="http://schemas.openxmlformats.org/wordprocessingml/2006/main" w:ilvl="0">
+  <w:abstractNum w:abstractNumId="2" w15:restartNumberingAfterBreak="0">
+    <w:nsid w:val="1E172895"/>
+    <w:multiLevelType w:val="hybridMultilevel"/>
+    <w:tmpl w:val="53B6C488"/>
+    <w:lvl w:ilvl="0" w:tplc="2800DBE0">
       <w:start w:val="1"/>
       <w:numFmt w:val="decimal"/>
       <w:lvlText w:val="%1."/>
@@ -566,7 +533,7 @@
         <w:ind w:left="720" w:hanging="360"/>
       </w:pPr>
     </w:lvl>
-    <w:lvl xmlns:w="http://schemas.openxmlformats.org/wordprocessingml/2006/main" w:ilvl="1">
+    <w:lvl w:ilvl="1" w:tplc="A3EAE5E0">
       <w:start w:val="1"/>
       <w:numFmt w:val="lowerLetter"/>
       <w:lvlText w:val="%2."/>
@@ -575,7 +542,7 @@
         <w:ind w:left="1440" w:hanging="360"/>
       </w:pPr>
     </w:lvl>
-    <w:lvl xmlns:w="http://schemas.openxmlformats.org/wordprocessingml/2006/main" w:ilvl="2">
+    <w:lvl w:ilvl="2" w:tplc="4BF0BE06">
       <w:start w:val="1"/>
       <w:numFmt w:val="lowerRoman"/>
       <w:lvlText w:val="%3."/>
@@ -584,7 +551,7 @@
         <w:ind w:left="2160" w:hanging="180"/>
       </w:pPr>
     </w:lvl>
-    <w:lvl xmlns:w="http://schemas.openxmlformats.org/wordprocessingml/2006/main" w:ilvl="3">
+    <w:lvl w:ilvl="3" w:tplc="9C642B5E">
       <w:start w:val="1"/>
       <w:numFmt w:val="decimal"/>
       <w:lvlText w:val="%4."/>
@@ -593,7 +560,7 @@
         <w:ind w:left="2880" w:hanging="360"/>
       </w:pPr>
     </w:lvl>
-    <w:lvl xmlns:w="http://schemas.openxmlformats.org/wordprocessingml/2006/main" w:ilvl="4">
+    <w:lvl w:ilvl="4" w:tplc="20F850F0">
       <w:start w:val="1"/>
       <w:numFmt w:val="lowerLetter"/>
       <w:lvlText w:val="%5."/>
@@ -602,7 +569,7 @@
         <w:ind w:left="3600" w:hanging="360"/>
       </w:pPr>
     </w:lvl>
-    <w:lvl xmlns:w="http://schemas.openxmlformats.org/wordprocessingml/2006/main" w:ilvl="5">
+    <w:lvl w:ilvl="5" w:tplc="751C44FC">
       <w:start w:val="1"/>
       <w:numFmt w:val="lowerRoman"/>
       <w:lvlText w:val="%6."/>
@@ -611,7 +578,7 @@
         <w:ind w:left="4320" w:hanging="180"/>
       </w:pPr>
     </w:lvl>
-    <w:lvl xmlns:w="http://schemas.openxmlformats.org/wordprocessingml/2006/main" w:ilvl="6">
+    <w:lvl w:ilvl="6" w:tplc="F59E4710">
       <w:start w:val="1"/>
       <w:numFmt w:val="decimal"/>
       <w:lvlText w:val="%7."/>
@@ -620,7 +587,7 @@
         <w:ind w:left="5040" w:hanging="360"/>
       </w:pPr>
     </w:lvl>
-    <w:lvl xmlns:w="http://schemas.openxmlformats.org/wordprocessingml/2006/main" w:ilvl="7">
+    <w:lvl w:ilvl="7" w:tplc="AC166980">
       <w:start w:val="1"/>
       <w:numFmt w:val="lowerLetter"/>
       <w:lvlText w:val="%8."/>
@@ -629,7 +596,7 @@
         <w:ind w:left="5760" w:hanging="360"/>
       </w:pPr>
     </w:lvl>
-    <w:lvl xmlns:w="http://schemas.openxmlformats.org/wordprocessingml/2006/main" w:ilvl="8">
+    <w:lvl w:ilvl="8" w:tplc="E84651CC">
       <w:start w:val="1"/>
       <w:numFmt w:val="lowerRoman"/>
       <w:lvlText w:val="%9."/>
@@ -639,19 +606,106 @@
       </w:pPr>
     </w:lvl>
   </w:abstractNum>
-  <w:abstractNum xmlns:w="http://schemas.openxmlformats.org/wordprocessingml/2006/main" w:abstractNumId="7">
-    <w:nsid w:val="2ae8b608"/>
-    <w:multiLevelType xmlns:w="http://schemas.openxmlformats.org/wordprocessingml/2006/main" w:val="hybridMultilevel"/>
-    <w:lvl xmlns:w="http://schemas.openxmlformats.org/wordprocessingml/2006/main" w:ilvl="0">
+  <w:abstractNum w:abstractNumId="3" w15:restartNumberingAfterBreak="0">
+    <w:nsid w:val="25BD720C"/>
+    <w:multiLevelType w:val="hybridMultilevel"/>
+    <w:tmpl w:val="16761B38"/>
+    <w:lvl w:ilvl="0" w:tplc="99A843DA">
       <w:start w:val="1"/>
       <w:numFmt w:val="decimal"/>
       <w:lvlText w:val="%1."/>
       <w:lvlJc w:val="left"/>
       <w:pPr>
+        <w:ind w:left="1080" w:hanging="360"/>
+      </w:pPr>
+    </w:lvl>
+    <w:lvl w:ilvl="1" w:tplc="61E86D7A">
+      <w:start w:val="1"/>
+      <w:numFmt w:val="lowerLetter"/>
+      <w:lvlText w:val="%2."/>
+      <w:lvlJc w:val="left"/>
+      <w:pPr>
+        <w:ind w:left="1800" w:hanging="360"/>
+      </w:pPr>
+    </w:lvl>
+    <w:lvl w:ilvl="2" w:tplc="76ECAF0C">
+      <w:start w:val="1"/>
+      <w:numFmt w:val="lowerRoman"/>
+      <w:lvlText w:val="%3."/>
+      <w:lvlJc w:val="right"/>
+      <w:pPr>
+        <w:ind w:left="2520" w:hanging="180"/>
+      </w:pPr>
+    </w:lvl>
+    <w:lvl w:ilvl="3" w:tplc="DBF62714">
+      <w:start w:val="1"/>
+      <w:numFmt w:val="decimal"/>
+      <w:lvlText w:val="%4."/>
+      <w:lvlJc w:val="left"/>
+      <w:pPr>
+        <w:ind w:left="3240" w:hanging="360"/>
+      </w:pPr>
+    </w:lvl>
+    <w:lvl w:ilvl="4" w:tplc="73643430">
+      <w:start w:val="1"/>
+      <w:numFmt w:val="lowerLetter"/>
+      <w:lvlText w:val="%5."/>
+      <w:lvlJc w:val="left"/>
+      <w:pPr>
+        <w:ind w:left="3960" w:hanging="360"/>
+      </w:pPr>
+    </w:lvl>
+    <w:lvl w:ilvl="5" w:tplc="97AC1610">
+      <w:start w:val="1"/>
+      <w:numFmt w:val="lowerRoman"/>
+      <w:lvlText w:val="%6."/>
+      <w:lvlJc w:val="right"/>
+      <w:pPr>
+        <w:ind w:left="4680" w:hanging="180"/>
+      </w:pPr>
+    </w:lvl>
+    <w:lvl w:ilvl="6" w:tplc="CA780F48">
+      <w:start w:val="1"/>
+      <w:numFmt w:val="decimal"/>
+      <w:lvlText w:val="%7."/>
+      <w:lvlJc w:val="left"/>
+      <w:pPr>
+        <w:ind w:left="5400" w:hanging="360"/>
+      </w:pPr>
+    </w:lvl>
+    <w:lvl w:ilvl="7" w:tplc="AE76854C">
+      <w:start w:val="1"/>
+      <w:numFmt w:val="lowerLetter"/>
+      <w:lvlText w:val="%8."/>
+      <w:lvlJc w:val="left"/>
+      <w:pPr>
+        <w:ind w:left="6120" w:hanging="360"/>
+      </w:pPr>
+    </w:lvl>
+    <w:lvl w:ilvl="8" w:tplc="54745A9A">
+      <w:start w:val="1"/>
+      <w:numFmt w:val="lowerRoman"/>
+      <w:lvlText w:val="%9."/>
+      <w:lvlJc w:val="right"/>
+      <w:pPr>
+        <w:ind w:left="6840" w:hanging="180"/>
+      </w:pPr>
+    </w:lvl>
+  </w:abstractNum>
+  <w:abstractNum w:abstractNumId="4" w15:restartNumberingAfterBreak="0">
+    <w:nsid w:val="2AE8B608"/>
+    <w:multiLevelType w:val="hybridMultilevel"/>
+    <w:tmpl w:val="0EF8B49A"/>
+    <w:lvl w:ilvl="0" w:tplc="0AC0A980">
+      <w:start w:val="1"/>
+      <w:numFmt w:val="decimal"/>
+      <w:lvlText w:val="%1."/>
+      <w:lvlJc w:val="left"/>
+      <w:pPr>
         <w:ind w:left="720" w:hanging="360"/>
       </w:pPr>
     </w:lvl>
-    <w:lvl xmlns:w="http://schemas.openxmlformats.org/wordprocessingml/2006/main" w:ilvl="1">
+    <w:lvl w:ilvl="1" w:tplc="FE8E3D7A">
       <w:start w:val="1"/>
       <w:numFmt w:val="lowerLetter"/>
       <w:lvlText w:val="%2."/>
@@ -660,7 +714,7 @@
         <w:ind w:left="1440" w:hanging="360"/>
       </w:pPr>
     </w:lvl>
-    <w:lvl xmlns:w="http://schemas.openxmlformats.org/wordprocessingml/2006/main" w:ilvl="2">
+    <w:lvl w:ilvl="2" w:tplc="E6DABD8A">
       <w:start w:val="1"/>
       <w:numFmt w:val="lowerRoman"/>
       <w:lvlText w:val="%3."/>
@@ -669,7 +723,7 @@
         <w:ind w:left="2160" w:hanging="180"/>
       </w:pPr>
     </w:lvl>
-    <w:lvl xmlns:w="http://schemas.openxmlformats.org/wordprocessingml/2006/main" w:ilvl="3">
+    <w:lvl w:ilvl="3" w:tplc="D9B211EE">
       <w:start w:val="1"/>
       <w:numFmt w:val="decimal"/>
       <w:lvlText w:val="%4."/>
@@ -678,7 +732,7 @@
         <w:ind w:left="2880" w:hanging="360"/>
       </w:pPr>
     </w:lvl>
-    <w:lvl xmlns:w="http://schemas.openxmlformats.org/wordprocessingml/2006/main" w:ilvl="4">
+    <w:lvl w:ilvl="4" w:tplc="2226937A">
       <w:start w:val="1"/>
       <w:numFmt w:val="lowerLetter"/>
       <w:lvlText w:val="%5."/>
@@ -687,7 +741,7 @@
         <w:ind w:left="3600" w:hanging="360"/>
       </w:pPr>
     </w:lvl>
-    <w:lvl xmlns:w="http://schemas.openxmlformats.org/wordprocessingml/2006/main" w:ilvl="5">
+    <w:lvl w:ilvl="5" w:tplc="47A26784">
       <w:start w:val="1"/>
       <w:numFmt w:val="lowerRoman"/>
       <w:lvlText w:val="%6."/>
@@ -696,7 +750,7 @@
         <w:ind w:left="4320" w:hanging="180"/>
       </w:pPr>
     </w:lvl>
-    <w:lvl xmlns:w="http://schemas.openxmlformats.org/wordprocessingml/2006/main" w:ilvl="6">
+    <w:lvl w:ilvl="6" w:tplc="9C1EC61C">
       <w:start w:val="1"/>
       <w:numFmt w:val="decimal"/>
       <w:lvlText w:val="%7."/>
@@ -705,7 +759,7 @@
         <w:ind w:left="5040" w:hanging="360"/>
       </w:pPr>
     </w:lvl>
-    <w:lvl xmlns:w="http://schemas.openxmlformats.org/wordprocessingml/2006/main" w:ilvl="7">
+    <w:lvl w:ilvl="7" w:tplc="B4DAA766">
       <w:start w:val="1"/>
       <w:numFmt w:val="lowerLetter"/>
       <w:lvlText w:val="%8."/>
@@ -714,7 +768,7 @@
         <w:ind w:left="5760" w:hanging="360"/>
       </w:pPr>
     </w:lvl>
-    <w:lvl xmlns:w="http://schemas.openxmlformats.org/wordprocessingml/2006/main" w:ilvl="8">
+    <w:lvl w:ilvl="8" w:tplc="8A8E1276">
       <w:start w:val="1"/>
       <w:numFmt w:val="lowerRoman"/>
       <w:lvlText w:val="%9."/>
@@ -724,265 +778,97 @@
       </w:pPr>
     </w:lvl>
   </w:abstractNum>
-  <w:abstractNum xmlns:w="http://schemas.openxmlformats.org/wordprocessingml/2006/main" w:abstractNumId="6">
-    <w:nsid w:val="25bd720c"/>
-    <w:multiLevelType xmlns:w="http://schemas.openxmlformats.org/wordprocessingml/2006/main" w:val="hybridMultilevel"/>
-    <w:lvl xmlns:w="http://schemas.openxmlformats.org/wordprocessingml/2006/main" w:ilvl="0">
+  <w:abstractNum w:abstractNumId="5" w15:restartNumberingAfterBreak="0">
+    <w:nsid w:val="33C58BE4"/>
+    <w:multiLevelType w:val="hybridMultilevel"/>
+    <w:tmpl w:val="0A1E9F10"/>
+    <w:lvl w:ilvl="0" w:tplc="D47E6982">
       <w:start w:val="1"/>
       <w:numFmt w:val="decimal"/>
       <w:lvlText w:val="%1."/>
       <w:lvlJc w:val="left"/>
       <w:pPr>
-        <w:ind w:left="1080" w:hanging="360"/>
-      </w:pPr>
-    </w:lvl>
-    <w:lvl xmlns:w="http://schemas.openxmlformats.org/wordprocessingml/2006/main" w:ilvl="1">
+        <w:ind w:left="720" w:hanging="360"/>
+      </w:pPr>
+    </w:lvl>
+    <w:lvl w:ilvl="1" w:tplc="40BA72BC">
       <w:start w:val="1"/>
       <w:numFmt w:val="lowerLetter"/>
       <w:lvlText w:val="%2."/>
       <w:lvlJc w:val="left"/>
       <w:pPr>
-        <w:ind w:left="1800" w:hanging="360"/>
-      </w:pPr>
-    </w:lvl>
-    <w:lvl xmlns:w="http://schemas.openxmlformats.org/wordprocessingml/2006/main" w:ilvl="2">
+        <w:ind w:left="1440" w:hanging="360"/>
+      </w:pPr>
+    </w:lvl>
+    <w:lvl w:ilvl="2" w:tplc="22FEF3C8">
       <w:start w:val="1"/>
       <w:numFmt w:val="lowerRoman"/>
       <w:lvlText w:val="%3."/>
       <w:lvlJc w:val="right"/>
       <w:pPr>
-        <w:ind w:left="2520" w:hanging="180"/>
-      </w:pPr>
-    </w:lvl>
-    <w:lvl xmlns:w="http://schemas.openxmlformats.org/wordprocessingml/2006/main" w:ilvl="3">
+        <w:ind w:left="2160" w:hanging="180"/>
+      </w:pPr>
+    </w:lvl>
+    <w:lvl w:ilvl="3" w:tplc="C6A64CAE">
       <w:start w:val="1"/>
       <w:numFmt w:val="decimal"/>
       <w:lvlText w:val="%4."/>
       <w:lvlJc w:val="left"/>
       <w:pPr>
-        <w:ind w:left="3240" w:hanging="360"/>
-      </w:pPr>
-    </w:lvl>
-    <w:lvl xmlns:w="http://schemas.openxmlformats.org/wordprocessingml/2006/main" w:ilvl="4">
+        <w:ind w:left="2880" w:hanging="360"/>
+      </w:pPr>
+    </w:lvl>
+    <w:lvl w:ilvl="4" w:tplc="3476212A">
       <w:start w:val="1"/>
       <w:numFmt w:val="lowerLetter"/>
       <w:lvlText w:val="%5."/>
       <w:lvlJc w:val="left"/>
       <w:pPr>
-        <w:ind w:left="3960" w:hanging="360"/>
-      </w:pPr>
-    </w:lvl>
-    <w:lvl xmlns:w="http://schemas.openxmlformats.org/wordprocessingml/2006/main" w:ilvl="5">
+        <w:ind w:left="3600" w:hanging="360"/>
+      </w:pPr>
+    </w:lvl>
+    <w:lvl w:ilvl="5" w:tplc="B3B22EF4">
       <w:start w:val="1"/>
       <w:numFmt w:val="lowerRoman"/>
       <w:lvlText w:val="%6."/>
       <w:lvlJc w:val="right"/>
       <w:pPr>
-        <w:ind w:left="4680" w:hanging="180"/>
-      </w:pPr>
-    </w:lvl>
-    <w:lvl xmlns:w="http://schemas.openxmlformats.org/wordprocessingml/2006/main" w:ilvl="6">
+        <w:ind w:left="4320" w:hanging="180"/>
+      </w:pPr>
+    </w:lvl>
+    <w:lvl w:ilvl="6" w:tplc="A7CE1E44">
       <w:start w:val="1"/>
       <w:numFmt w:val="decimal"/>
       <w:lvlText w:val="%7."/>
       <w:lvlJc w:val="left"/>
       <w:pPr>
-        <w:ind w:left="5400" w:hanging="360"/>
-      </w:pPr>
-    </w:lvl>
-    <w:lvl xmlns:w="http://schemas.openxmlformats.org/wordprocessingml/2006/main" w:ilvl="7">
+        <w:ind w:left="5040" w:hanging="360"/>
+      </w:pPr>
+    </w:lvl>
+    <w:lvl w:ilvl="7" w:tplc="6DC4777A">
       <w:start w:val="1"/>
       <w:numFmt w:val="lowerLetter"/>
       <w:lvlText w:val="%8."/>
       <w:lvlJc w:val="left"/>
       <w:pPr>
-        <w:ind w:left="6120" w:hanging="360"/>
-      </w:pPr>
-    </w:lvl>
-    <w:lvl xmlns:w="http://schemas.openxmlformats.org/wordprocessingml/2006/main" w:ilvl="8">
+        <w:ind w:left="5760" w:hanging="360"/>
+      </w:pPr>
+    </w:lvl>
+    <w:lvl w:ilvl="8" w:tplc="22547986">
       <w:start w:val="1"/>
       <w:numFmt w:val="lowerRoman"/>
       <w:lvlText w:val="%9."/>
       <w:lvlJc w:val="right"/>
       <w:pPr>
-        <w:ind w:left="6840" w:hanging="180"/>
+        <w:ind w:left="6480" w:hanging="180"/>
       </w:pPr>
     </w:lvl>
   </w:abstractNum>
-  <w:abstractNum xmlns:w="http://schemas.openxmlformats.org/wordprocessingml/2006/main" w:abstractNumId="5">
-    <w:nsid w:val="33c58be4"/>
-    <w:multiLevelType xmlns:w="http://schemas.openxmlformats.org/wordprocessingml/2006/main" w:val="hybridMultilevel"/>
-    <w:lvl xmlns:w="http://schemas.openxmlformats.org/wordprocessingml/2006/main" w:ilvl="0">
-      <w:start w:val="1"/>
-      <w:numFmt w:val="decimal"/>
-      <w:lvlText w:val="%1."/>
-      <w:lvlJc w:val="left"/>
-      <w:pPr>
-        <w:ind w:left="720" w:hanging="360"/>
-      </w:pPr>
-    </w:lvl>
-    <w:lvl xmlns:w="http://schemas.openxmlformats.org/wordprocessingml/2006/main" w:ilvl="1">
-      <w:start w:val="1"/>
-      <w:numFmt w:val="lowerLetter"/>
-      <w:lvlText w:val="%2."/>
-      <w:lvlJc w:val="left"/>
-      <w:pPr>
-        <w:ind w:left="1440" w:hanging="360"/>
-      </w:pPr>
-    </w:lvl>
-    <w:lvl xmlns:w="http://schemas.openxmlformats.org/wordprocessingml/2006/main" w:ilvl="2">
-      <w:start w:val="1"/>
-      <w:numFmt w:val="lowerRoman"/>
-      <w:lvlText w:val="%3."/>
-      <w:lvlJc w:val="right"/>
-      <w:pPr>
-        <w:ind w:left="2160" w:hanging="180"/>
-      </w:pPr>
-    </w:lvl>
-    <w:lvl xmlns:w="http://schemas.openxmlformats.org/wordprocessingml/2006/main" w:ilvl="3">
-      <w:start w:val="1"/>
-      <w:numFmt w:val="decimal"/>
-      <w:lvlText w:val="%4."/>
-      <w:lvlJc w:val="left"/>
-      <w:pPr>
-        <w:ind w:left="2880" w:hanging="360"/>
-      </w:pPr>
-    </w:lvl>
-    <w:lvl xmlns:w="http://schemas.openxmlformats.org/wordprocessingml/2006/main" w:ilvl="4">
-      <w:start w:val="1"/>
-      <w:numFmt w:val="lowerLetter"/>
-      <w:lvlText w:val="%5."/>
-      <w:lvlJc w:val="left"/>
-      <w:pPr>
-        <w:ind w:left="3600" w:hanging="360"/>
-      </w:pPr>
-    </w:lvl>
-    <w:lvl xmlns:w="http://schemas.openxmlformats.org/wordprocessingml/2006/main" w:ilvl="5">
-      <w:start w:val="1"/>
-      <w:numFmt w:val="lowerRoman"/>
-      <w:lvlText w:val="%6."/>
-      <w:lvlJc w:val="right"/>
-      <w:pPr>
-        <w:ind w:left="4320" w:hanging="180"/>
-      </w:pPr>
-    </w:lvl>
-    <w:lvl xmlns:w="http://schemas.openxmlformats.org/wordprocessingml/2006/main" w:ilvl="6">
-      <w:start w:val="1"/>
-      <w:numFmt w:val="decimal"/>
-      <w:lvlText w:val="%7."/>
-      <w:lvlJc w:val="left"/>
-      <w:pPr>
-        <w:ind w:left="5040" w:hanging="360"/>
-      </w:pPr>
-    </w:lvl>
-    <w:lvl xmlns:w="http://schemas.openxmlformats.org/wordprocessingml/2006/main" w:ilvl="7">
-      <w:start w:val="1"/>
-      <w:numFmt w:val="lowerLetter"/>
-      <w:lvlText w:val="%8."/>
-      <w:lvlJc w:val="left"/>
-      <w:pPr>
-        <w:ind w:left="5760" w:hanging="360"/>
-      </w:pPr>
-    </w:lvl>
-    <w:lvl xmlns:w="http://schemas.openxmlformats.org/wordprocessingml/2006/main" w:ilvl="8">
-      <w:start w:val="1"/>
-      <w:numFmt w:val="lowerRoman"/>
-      <w:lvlText w:val="%9."/>
-      <w:lvlJc w:val="right"/>
-      <w:pPr>
-        <w:ind w:left="6480" w:hanging="180"/>
-      </w:pPr>
-    </w:lvl>
-  </w:abstractNum>
-  <w:abstractNum xmlns:w="http://schemas.openxmlformats.org/wordprocessingml/2006/main" w:abstractNumId="4">
-    <w:nsid w:val="72c71cc2"/>
-    <w:multiLevelType xmlns:w="http://schemas.openxmlformats.org/wordprocessingml/2006/main" w:val="hybridMultilevel"/>
-    <w:lvl xmlns:w="http://schemas.openxmlformats.org/wordprocessingml/2006/main" w:ilvl="0">
-      <w:start w:val="1"/>
-      <w:numFmt w:val="decimal"/>
-      <w:lvlText w:val="%1."/>
-      <w:lvlJc w:val="left"/>
-      <w:pPr>
-        <w:ind w:left="720" w:hanging="360"/>
-      </w:pPr>
-    </w:lvl>
-    <w:lvl xmlns:w="http://schemas.openxmlformats.org/wordprocessingml/2006/main" w:ilvl="1">
-      <w:start w:val="1"/>
-      <w:numFmt w:val="lowerLetter"/>
-      <w:lvlText w:val="%2."/>
-      <w:lvlJc w:val="left"/>
-      <w:pPr>
-        <w:ind w:left="1440" w:hanging="360"/>
-      </w:pPr>
-    </w:lvl>
-    <w:lvl xmlns:w="http://schemas.openxmlformats.org/wordprocessingml/2006/main" w:ilvl="2">
-      <w:start w:val="1"/>
-      <w:numFmt w:val="lowerRoman"/>
-      <w:lvlText w:val="%3."/>
-      <w:lvlJc w:val="right"/>
-      <w:pPr>
-        <w:ind w:left="2160" w:hanging="180"/>
-      </w:pPr>
-    </w:lvl>
-    <w:lvl xmlns:w="http://schemas.openxmlformats.org/wordprocessingml/2006/main" w:ilvl="3">
-      <w:start w:val="1"/>
-      <w:numFmt w:val="decimal"/>
-      <w:lvlText w:val="%4."/>
-      <w:lvlJc w:val="left"/>
-      <w:pPr>
-        <w:ind w:left="2880" w:hanging="360"/>
-      </w:pPr>
-    </w:lvl>
-    <w:lvl xmlns:w="http://schemas.openxmlformats.org/wordprocessingml/2006/main" w:ilvl="4">
-      <w:start w:val="1"/>
-      <w:numFmt w:val="lowerLetter"/>
-      <w:lvlText w:val="%5."/>
-      <w:lvlJc w:val="left"/>
-      <w:pPr>
-        <w:ind w:left="3600" w:hanging="360"/>
-      </w:pPr>
-    </w:lvl>
-    <w:lvl xmlns:w="http://schemas.openxmlformats.org/wordprocessingml/2006/main" w:ilvl="5">
-      <w:start w:val="1"/>
-      <w:numFmt w:val="lowerRoman"/>
-      <w:lvlText w:val="%6."/>
-      <w:lvlJc w:val="right"/>
-      <w:pPr>
-        <w:ind w:left="4320" w:hanging="180"/>
-      </w:pPr>
-    </w:lvl>
-    <w:lvl xmlns:w="http://schemas.openxmlformats.org/wordprocessingml/2006/main" w:ilvl="6">
-      <w:start w:val="1"/>
-      <w:numFmt w:val="decimal"/>
-      <w:lvlText w:val="%7."/>
-      <w:lvlJc w:val="left"/>
-      <w:pPr>
-        <w:ind w:left="5040" w:hanging="360"/>
-      </w:pPr>
-    </w:lvl>
-    <w:lvl xmlns:w="http://schemas.openxmlformats.org/wordprocessingml/2006/main" w:ilvl="7">
-      <w:start w:val="1"/>
-      <w:numFmt w:val="lowerLetter"/>
-      <w:lvlText w:val="%8."/>
-      <w:lvlJc w:val="left"/>
-      <w:pPr>
-        <w:ind w:left="5760" w:hanging="360"/>
-      </w:pPr>
-    </w:lvl>
-    <w:lvl xmlns:w="http://schemas.openxmlformats.org/wordprocessingml/2006/main" w:ilvl="8">
-      <w:start w:val="1"/>
-      <w:numFmt w:val="lowerRoman"/>
-      <w:lvlText w:val="%9."/>
-      <w:lvlJc w:val="right"/>
-      <w:pPr>
-        <w:ind w:left="6480" w:hanging="180"/>
-      </w:pPr>
-    </w:lvl>
-  </w:abstractNum>
-  <w:abstractNum xmlns:w="http://schemas.openxmlformats.org/wordprocessingml/2006/main" w:abstractNumId="3">
-    <w:nsid w:val="3a3d5c16"/>
-    <w:multiLevelType xmlns:w="http://schemas.openxmlformats.org/wordprocessingml/2006/main" w:val="hybridMultilevel"/>
-    <w:lvl xmlns:w="http://schemas.openxmlformats.org/wordprocessingml/2006/main" w:ilvl="0">
+  <w:abstractNum w:abstractNumId="6" w15:restartNumberingAfterBreak="0">
+    <w:nsid w:val="3A3D5C16"/>
+    <w:multiLevelType w:val="hybridMultilevel"/>
+    <w:tmpl w:val="839A120A"/>
+    <w:lvl w:ilvl="0" w:tplc="50FEAD4A">
       <w:start w:val="1"/>
       <w:numFmt w:val="bullet"/>
       <w:lvlText w:val=""/>
@@ -991,10 +877,10 @@
         <w:ind w:left="720" w:hanging="360"/>
       </w:pPr>
       <w:rPr>
-        <w:rFonts w:hint="default" w:ascii="Symbol" w:hAnsi="Symbol"/>
+        <w:rFonts w:ascii="Symbol" w:hAnsi="Symbol" w:hint="default"/>
       </w:rPr>
     </w:lvl>
-    <w:lvl xmlns:w="http://schemas.openxmlformats.org/wordprocessingml/2006/main" w:ilvl="1">
+    <w:lvl w:ilvl="1" w:tplc="5A749F5C">
       <w:start w:val="1"/>
       <w:numFmt w:val="lowerLetter"/>
       <w:lvlText w:val="%2."/>
@@ -1002,9 +888,8 @@
       <w:pPr>
         <w:ind w:left="1440" w:hanging="360"/>
       </w:pPr>
-      <w:rPr/>
-    </w:lvl>
-    <w:lvl xmlns:w="http://schemas.openxmlformats.org/wordprocessingml/2006/main" w:ilvl="2">
+    </w:lvl>
+    <w:lvl w:ilvl="2" w:tplc="2EF6F5EC">
       <w:start w:val="1"/>
       <w:numFmt w:val="lowerRoman"/>
       <w:lvlText w:val="%3."/>
@@ -1012,9 +897,8 @@
       <w:pPr>
         <w:ind w:left="2160" w:hanging="180"/>
       </w:pPr>
-      <w:rPr/>
-    </w:lvl>
-    <w:lvl xmlns:w="http://schemas.openxmlformats.org/wordprocessingml/2006/main" w:ilvl="3">
+    </w:lvl>
+    <w:lvl w:ilvl="3" w:tplc="E536063A">
       <w:start w:val="1"/>
       <w:numFmt w:val="decimal"/>
       <w:lvlText w:val="%4."/>
@@ -1022,9 +906,8 @@
       <w:pPr>
         <w:ind w:left="2880" w:hanging="360"/>
       </w:pPr>
-      <w:rPr/>
-    </w:lvl>
-    <w:lvl xmlns:w="http://schemas.openxmlformats.org/wordprocessingml/2006/main" w:ilvl="4">
+    </w:lvl>
+    <w:lvl w:ilvl="4" w:tplc="3D72B34A">
       <w:start w:val="1"/>
       <w:numFmt w:val="lowerLetter"/>
       <w:lvlText w:val="%5."/>
@@ -1032,9 +915,8 @@
       <w:pPr>
         <w:ind w:left="3600" w:hanging="360"/>
       </w:pPr>
-      <w:rPr/>
-    </w:lvl>
-    <w:lvl xmlns:w="http://schemas.openxmlformats.org/wordprocessingml/2006/main" w:ilvl="5">
+    </w:lvl>
+    <w:lvl w:ilvl="5" w:tplc="D6004328">
       <w:start w:val="1"/>
       <w:numFmt w:val="lowerRoman"/>
       <w:lvlText w:val="%6."/>
@@ -1042,9 +924,8 @@
       <w:pPr>
         <w:ind w:left="4320" w:hanging="180"/>
       </w:pPr>
-      <w:rPr/>
-    </w:lvl>
-    <w:lvl xmlns:w="http://schemas.openxmlformats.org/wordprocessingml/2006/main" w:ilvl="6">
+    </w:lvl>
+    <w:lvl w:ilvl="6" w:tplc="E7543A52">
       <w:start w:val="1"/>
       <w:numFmt w:val="decimal"/>
       <w:lvlText w:val="%7."/>
@@ -1052,9 +933,8 @@
       <w:pPr>
         <w:ind w:left="5040" w:hanging="360"/>
       </w:pPr>
-      <w:rPr/>
-    </w:lvl>
-    <w:lvl xmlns:w="http://schemas.openxmlformats.org/wordprocessingml/2006/main" w:ilvl="7">
+    </w:lvl>
+    <w:lvl w:ilvl="7" w:tplc="C4F2092C">
       <w:start w:val="1"/>
       <w:numFmt w:val="lowerLetter"/>
       <w:lvlText w:val="%8."/>
@@ -1062,9 +942,8 @@
       <w:pPr>
         <w:ind w:left="5760" w:hanging="360"/>
       </w:pPr>
-      <w:rPr/>
-    </w:lvl>
-    <w:lvl xmlns:w="http://schemas.openxmlformats.org/wordprocessingml/2006/main" w:ilvl="8">
+    </w:lvl>
+    <w:lvl w:ilvl="8" w:tplc="47782E42">
       <w:start w:val="1"/>
       <w:numFmt w:val="lowerRoman"/>
       <w:lvlText w:val="%9."/>
@@ -1072,13 +951,13 @@
       <w:pPr>
         <w:ind w:left="6480" w:hanging="180"/>
       </w:pPr>
-      <w:rPr/>
     </w:lvl>
   </w:abstractNum>
-  <w:abstractNum xmlns:w="http://schemas.openxmlformats.org/wordprocessingml/2006/main" w:abstractNumId="2">
-    <w:nsid w:val="5a3b36e7"/>
-    <w:multiLevelType xmlns:w="http://schemas.openxmlformats.org/wordprocessingml/2006/main" w:val="hybridMultilevel"/>
-    <w:lvl xmlns:w="http://schemas.openxmlformats.org/wordprocessingml/2006/main" w:ilvl="0">
+  <w:abstractNum w:abstractNumId="7" w15:restartNumberingAfterBreak="0">
+    <w:nsid w:val="5A3B36E7"/>
+    <w:multiLevelType w:val="hybridMultilevel"/>
+    <w:tmpl w:val="C68684EA"/>
+    <w:lvl w:ilvl="0" w:tplc="A39ABF66">
       <w:start w:val="1"/>
       <w:numFmt w:val="decimal"/>
       <w:lvlText w:val="%1."/>
@@ -1087,7 +966,7 @@
         <w:ind w:left="720" w:hanging="360"/>
       </w:pPr>
     </w:lvl>
-    <w:lvl xmlns:w="http://schemas.openxmlformats.org/wordprocessingml/2006/main" w:ilvl="1">
+    <w:lvl w:ilvl="1" w:tplc="56FA3322">
       <w:start w:val="1"/>
       <w:numFmt w:val="lowerLetter"/>
       <w:lvlText w:val="%2."/>
@@ -1096,7 +975,7 @@
         <w:ind w:left="1440" w:hanging="360"/>
       </w:pPr>
     </w:lvl>
-    <w:lvl xmlns:w="http://schemas.openxmlformats.org/wordprocessingml/2006/main" w:ilvl="2">
+    <w:lvl w:ilvl="2" w:tplc="F678F8D2">
       <w:start w:val="1"/>
       <w:numFmt w:val="lowerRoman"/>
       <w:lvlText w:val="%3."/>
@@ -1105,7 +984,7 @@
         <w:ind w:left="2160" w:hanging="180"/>
       </w:pPr>
     </w:lvl>
-    <w:lvl xmlns:w="http://schemas.openxmlformats.org/wordprocessingml/2006/main" w:ilvl="3">
+    <w:lvl w:ilvl="3" w:tplc="21D2B9DC">
       <w:start w:val="1"/>
       <w:numFmt w:val="decimal"/>
       <w:lvlText w:val="%4."/>
@@ -1114,7 +993,7 @@
         <w:ind w:left="2880" w:hanging="360"/>
       </w:pPr>
     </w:lvl>
-    <w:lvl xmlns:w="http://schemas.openxmlformats.org/wordprocessingml/2006/main" w:ilvl="4">
+    <w:lvl w:ilvl="4" w:tplc="D35C1CDA">
       <w:start w:val="1"/>
       <w:numFmt w:val="lowerLetter"/>
       <w:lvlText w:val="%5."/>
@@ -1123,7 +1002,7 @@
         <w:ind w:left="3600" w:hanging="360"/>
       </w:pPr>
     </w:lvl>
-    <w:lvl xmlns:w="http://schemas.openxmlformats.org/wordprocessingml/2006/main" w:ilvl="5">
+    <w:lvl w:ilvl="5" w:tplc="32D69F5A">
       <w:start w:val="1"/>
       <w:numFmt w:val="lowerRoman"/>
       <w:lvlText w:val="%6."/>
@@ -1132,7 +1011,7 @@
         <w:ind w:left="4320" w:hanging="180"/>
       </w:pPr>
     </w:lvl>
-    <w:lvl xmlns:w="http://schemas.openxmlformats.org/wordprocessingml/2006/main" w:ilvl="6">
+    <w:lvl w:ilvl="6" w:tplc="ED348D5E">
       <w:start w:val="1"/>
       <w:numFmt w:val="decimal"/>
       <w:lvlText w:val="%7."/>
@@ -1141,7 +1020,7 @@
         <w:ind w:left="5040" w:hanging="360"/>
       </w:pPr>
     </w:lvl>
-    <w:lvl xmlns:w="http://schemas.openxmlformats.org/wordprocessingml/2006/main" w:ilvl="7">
+    <w:lvl w:ilvl="7" w:tplc="D44297D2">
       <w:start w:val="1"/>
       <w:numFmt w:val="lowerLetter"/>
       <w:lvlText w:val="%8."/>
@@ -1150,7 +1029,7 @@
         <w:ind w:left="5760" w:hanging="360"/>
       </w:pPr>
     </w:lvl>
-    <w:lvl xmlns:w="http://schemas.openxmlformats.org/wordprocessingml/2006/main" w:ilvl="8">
+    <w:lvl w:ilvl="8" w:tplc="B9FCB1CC">
       <w:start w:val="1"/>
       <w:numFmt w:val="lowerRoman"/>
       <w:lvlText w:val="%9."/>
@@ -1160,10 +1039,11 @@
       </w:pPr>
     </w:lvl>
   </w:abstractNum>
-  <w:abstractNum xmlns:w="http://schemas.openxmlformats.org/wordprocessingml/2006/main" w:abstractNumId="1">
-    <w:nsid w:val="1d52b01a"/>
-    <w:multiLevelType xmlns:w="http://schemas.openxmlformats.org/wordprocessingml/2006/main" w:val="hybridMultilevel"/>
-    <w:lvl xmlns:w="http://schemas.openxmlformats.org/wordprocessingml/2006/main" w:ilvl="0">
+  <w:abstractNum w:abstractNumId="8" w15:restartNumberingAfterBreak="0">
+    <w:nsid w:val="68EFD58D"/>
+    <w:multiLevelType w:val="hybridMultilevel"/>
+    <w:tmpl w:val="F3303B1A"/>
+    <w:lvl w:ilvl="0" w:tplc="D1A418F0">
       <w:start w:val="1"/>
       <w:numFmt w:val="decimal"/>
       <w:lvlText w:val="%1."/>
@@ -1172,7 +1052,7 @@
         <w:ind w:left="720" w:hanging="360"/>
       </w:pPr>
     </w:lvl>
-    <w:lvl xmlns:w="http://schemas.openxmlformats.org/wordprocessingml/2006/main" w:ilvl="1">
+    <w:lvl w:ilvl="1" w:tplc="FFC24F40">
       <w:start w:val="1"/>
       <w:numFmt w:val="lowerLetter"/>
       <w:lvlText w:val="%2."/>
@@ -1181,7 +1061,7 @@
         <w:ind w:left="1440" w:hanging="360"/>
       </w:pPr>
     </w:lvl>
-    <w:lvl xmlns:w="http://schemas.openxmlformats.org/wordprocessingml/2006/main" w:ilvl="2">
+    <w:lvl w:ilvl="2" w:tplc="C91CE83A">
       <w:start w:val="1"/>
       <w:numFmt w:val="lowerRoman"/>
       <w:lvlText w:val="%3."/>
@@ -1190,7 +1070,7 @@
         <w:ind w:left="2160" w:hanging="180"/>
       </w:pPr>
     </w:lvl>
-    <w:lvl xmlns:w="http://schemas.openxmlformats.org/wordprocessingml/2006/main" w:ilvl="3">
+    <w:lvl w:ilvl="3" w:tplc="ADF0868A">
       <w:start w:val="1"/>
       <w:numFmt w:val="decimal"/>
       <w:lvlText w:val="%4."/>
@@ -1199,7 +1079,7 @@
         <w:ind w:left="2880" w:hanging="360"/>
       </w:pPr>
     </w:lvl>
-    <w:lvl xmlns:w="http://schemas.openxmlformats.org/wordprocessingml/2006/main" w:ilvl="4">
+    <w:lvl w:ilvl="4" w:tplc="03A063D6">
       <w:start w:val="1"/>
       <w:numFmt w:val="lowerLetter"/>
       <w:lvlText w:val="%5."/>
@@ -1208,7 +1088,7 @@
         <w:ind w:left="3600" w:hanging="360"/>
       </w:pPr>
     </w:lvl>
-    <w:lvl xmlns:w="http://schemas.openxmlformats.org/wordprocessingml/2006/main" w:ilvl="5">
+    <w:lvl w:ilvl="5" w:tplc="783E5060">
       <w:start w:val="1"/>
       <w:numFmt w:val="lowerRoman"/>
       <w:lvlText w:val="%6."/>
@@ -1217,7 +1097,7 @@
         <w:ind w:left="4320" w:hanging="180"/>
       </w:pPr>
     </w:lvl>
-    <w:lvl xmlns:w="http://schemas.openxmlformats.org/wordprocessingml/2006/main" w:ilvl="6">
+    <w:lvl w:ilvl="6" w:tplc="03F63CC4">
       <w:start w:val="1"/>
       <w:numFmt w:val="decimal"/>
       <w:lvlText w:val="%7."/>
@@ -1226,7 +1106,7 @@
         <w:ind w:left="5040" w:hanging="360"/>
       </w:pPr>
     </w:lvl>
-    <w:lvl xmlns:w="http://schemas.openxmlformats.org/wordprocessingml/2006/main" w:ilvl="7">
+    <w:lvl w:ilvl="7" w:tplc="9B96577C">
       <w:start w:val="1"/>
       <w:numFmt w:val="lowerLetter"/>
       <w:lvlText w:val="%8."/>
@@ -1235,7 +1115,7 @@
         <w:ind w:left="5760" w:hanging="360"/>
       </w:pPr>
     </w:lvl>
-    <w:lvl xmlns:w="http://schemas.openxmlformats.org/wordprocessingml/2006/main" w:ilvl="8">
+    <w:lvl w:ilvl="8" w:tplc="B6BCC1CE">
       <w:start w:val="1"/>
       <w:numFmt w:val="lowerRoman"/>
       <w:lvlText w:val="%9."/>
@@ -1245,34 +1125,120 @@
       </w:pPr>
     </w:lvl>
   </w:abstractNum>
-  <w:num w:numId="10">
-    <w:abstractNumId w:val="10"/>
+  <w:abstractNum w:abstractNumId="9" w15:restartNumberingAfterBreak="0">
+    <w:nsid w:val="72C71CC2"/>
+    <w:multiLevelType w:val="hybridMultilevel"/>
+    <w:tmpl w:val="9BB4CFC0"/>
+    <w:lvl w:ilvl="0" w:tplc="89948858">
+      <w:start w:val="1"/>
+      <w:numFmt w:val="decimal"/>
+      <w:lvlText w:val="%1."/>
+      <w:lvlJc w:val="left"/>
+      <w:pPr>
+        <w:ind w:left="720" w:hanging="360"/>
+      </w:pPr>
+    </w:lvl>
+    <w:lvl w:ilvl="1" w:tplc="0FC667E8">
+      <w:start w:val="1"/>
+      <w:numFmt w:val="lowerLetter"/>
+      <w:lvlText w:val="%2."/>
+      <w:lvlJc w:val="left"/>
+      <w:pPr>
+        <w:ind w:left="1440" w:hanging="360"/>
+      </w:pPr>
+    </w:lvl>
+    <w:lvl w:ilvl="2" w:tplc="9A8422E8">
+      <w:start w:val="1"/>
+      <w:numFmt w:val="lowerRoman"/>
+      <w:lvlText w:val="%3."/>
+      <w:lvlJc w:val="right"/>
+      <w:pPr>
+        <w:ind w:left="2160" w:hanging="180"/>
+      </w:pPr>
+    </w:lvl>
+    <w:lvl w:ilvl="3" w:tplc="95926976">
+      <w:start w:val="1"/>
+      <w:numFmt w:val="decimal"/>
+      <w:lvlText w:val="%4."/>
+      <w:lvlJc w:val="left"/>
+      <w:pPr>
+        <w:ind w:left="2880" w:hanging="360"/>
+      </w:pPr>
+    </w:lvl>
+    <w:lvl w:ilvl="4" w:tplc="2A74FABC">
+      <w:start w:val="1"/>
+      <w:numFmt w:val="lowerLetter"/>
+      <w:lvlText w:val="%5."/>
+      <w:lvlJc w:val="left"/>
+      <w:pPr>
+        <w:ind w:left="3600" w:hanging="360"/>
+      </w:pPr>
+    </w:lvl>
+    <w:lvl w:ilvl="5" w:tplc="ACB6444E">
+      <w:start w:val="1"/>
+      <w:numFmt w:val="lowerRoman"/>
+      <w:lvlText w:val="%6."/>
+      <w:lvlJc w:val="right"/>
+      <w:pPr>
+        <w:ind w:left="4320" w:hanging="180"/>
+      </w:pPr>
+    </w:lvl>
+    <w:lvl w:ilvl="6" w:tplc="D00E272A">
+      <w:start w:val="1"/>
+      <w:numFmt w:val="decimal"/>
+      <w:lvlText w:val="%7."/>
+      <w:lvlJc w:val="left"/>
+      <w:pPr>
+        <w:ind w:left="5040" w:hanging="360"/>
+      </w:pPr>
+    </w:lvl>
+    <w:lvl w:ilvl="7" w:tplc="01BAB3B0">
+      <w:start w:val="1"/>
+      <w:numFmt w:val="lowerLetter"/>
+      <w:lvlText w:val="%8."/>
+      <w:lvlJc w:val="left"/>
+      <w:pPr>
+        <w:ind w:left="5760" w:hanging="360"/>
+      </w:pPr>
+    </w:lvl>
+    <w:lvl w:ilvl="8" w:tplc="15D2823C">
+      <w:start w:val="1"/>
+      <w:numFmt w:val="lowerRoman"/>
+      <w:lvlText w:val="%9."/>
+      <w:lvlJc w:val="right"/>
+      <w:pPr>
+        <w:ind w:left="6480" w:hanging="180"/>
+      </w:pPr>
+    </w:lvl>
+  </w:abstractNum>
+  <w:num w:numId="1" w16cid:durableId="1040477359">
+    <w:abstractNumId w:val="0"/>
   </w:num>
-  <w:num w:numId="9">
+  <w:num w:numId="2" w16cid:durableId="221791820">
+    <w:abstractNumId w:val="8"/>
+  </w:num>
+  <w:num w:numId="3" w16cid:durableId="323705394">
+    <w:abstractNumId w:val="2"/>
+  </w:num>
+  <w:num w:numId="4" w16cid:durableId="494539319">
+    <w:abstractNumId w:val="4"/>
+  </w:num>
+  <w:num w:numId="5" w16cid:durableId="1901283279">
+    <w:abstractNumId w:val="3"/>
+  </w:num>
+  <w:num w:numId="6" w16cid:durableId="717556060">
+    <w:abstractNumId w:val="5"/>
+  </w:num>
+  <w:num w:numId="7" w16cid:durableId="1078140079">
     <w:abstractNumId w:val="9"/>
   </w:num>
-  <w:num w:numId="8">
-    <w:abstractNumId w:val="8"/>
+  <w:num w:numId="8" w16cid:durableId="434592711">
+    <w:abstractNumId w:val="6"/>
   </w:num>
-  <w:num w:numId="7">
+  <w:num w:numId="9" w16cid:durableId="1112896533">
     <w:abstractNumId w:val="7"/>
   </w:num>
-  <w:num w:numId="6">
-    <w:abstractNumId w:val="6"/>
-  </w:num>
-  <w:num w:numId="5">
-    <w:abstractNumId w:val="5"/>
-  </w:num>
-  <w:num w:numId="4">
-    <w:abstractNumId w:val="4"/>
-  </w:num>
-  <w:num w:numId="3">
-    <w:abstractNumId w:val="3"/>
-  </w:num>
-  <w:num w:numId="2">
-    <w:abstractNumId w:val="2"/>
-  </w:num>
-  <w:num w:numId="1">
+  <w:num w:numId="10" w16cid:durableId="1630477253">
     <w:abstractNumId w:val="1"/>
   </w:num>
 </w:numbering>
@@ -1283,7 +1249,7 @@
   <w:docDefaults>
     <w:rPrDefault>
       <w:rPr>
-        <w:rFonts w:asciiTheme="minorHAnsi" w:hAnsiTheme="minorHAnsi" w:eastAsiaTheme="minorHAnsi" w:cstheme="minorBidi"/>
+        <w:rFonts w:asciiTheme="minorHAnsi" w:eastAsiaTheme="minorHAnsi" w:hAnsiTheme="minorHAnsi" w:cstheme="minorBidi"/>
         <w:kern w:val="2"/>
         <w:sz w:val="24"/>
         <w:szCs w:val="24"/>
@@ -1300,14 +1266,14 @@
   <w:latentStyles w:defLockedState="0" w:defUIPriority="99" w:defSemiHidden="0" w:defUnhideWhenUsed="0" w:defQFormat="0" w:count="376">
     <w:lsdException w:name="Normal" w:uiPriority="0" w:qFormat="1"/>
     <w:lsdException w:name="heading 1" w:uiPriority="9" w:qFormat="1"/>
-    <w:lsdException w:name="heading 2" w:uiPriority="9" w:semiHidden="1" w:unhideWhenUsed="1" w:qFormat="1"/>
-    <w:lsdException w:name="heading 3" w:uiPriority="9" w:semiHidden="1" w:unhideWhenUsed="1" w:qFormat="1"/>
-    <w:lsdException w:name="heading 4" w:uiPriority="9" w:semiHidden="1" w:unhideWhenUsed="1" w:qFormat="1"/>
-    <w:lsdException w:name="heading 5" w:uiPriority="9" w:semiHidden="1" w:unhideWhenUsed="1" w:qFormat="1"/>
-    <w:lsdException w:name="heading 6" w:uiPriority="9" w:semiHidden="1" w:unhideWhenUsed="1" w:qFormat="1"/>
-    <w:lsdException w:name="heading 7" w:uiPriority="9" w:semiHidden="1" w:unhideWhenUsed="1" w:qFormat="1"/>
-    <w:lsdException w:name="heading 8" w:uiPriority="9" w:semiHidden="1" w:unhideWhenUsed="1" w:qFormat="1"/>
-    <w:lsdException w:name="heading 9" w:uiPriority="9" w:semiHidden="1" w:unhideWhenUsed="1" w:qFormat="1"/>
+    <w:lsdException w:name="heading 2" w:semiHidden="1" w:uiPriority="9" w:unhideWhenUsed="1" w:qFormat="1"/>
+    <w:lsdException w:name="heading 3" w:semiHidden="1" w:uiPriority="9" w:unhideWhenUsed="1" w:qFormat="1"/>
+    <w:lsdException w:name="heading 4" w:semiHidden="1" w:uiPriority="9" w:unhideWhenUsed="1" w:qFormat="1"/>
+    <w:lsdException w:name="heading 5" w:semiHidden="1" w:uiPriority="9" w:unhideWhenUsed="1" w:qFormat="1"/>
+    <w:lsdException w:name="heading 6" w:semiHidden="1" w:uiPriority="9" w:unhideWhenUsed="1" w:qFormat="1"/>
+    <w:lsdException w:name="heading 7" w:semiHidden="1" w:uiPriority="9" w:unhideWhenUsed="1" w:qFormat="1"/>
+    <w:lsdException w:name="heading 8" w:semiHidden="1" w:uiPriority="9" w:unhideWhenUsed="1" w:qFormat="1"/>
+    <w:lsdException w:name="heading 9" w:semiHidden="1" w:uiPriority="9" w:unhideWhenUsed="1" w:qFormat="1"/>
     <w:lsdException w:name="index 1" w:semiHidden="1" w:unhideWhenUsed="1"/>
     <w:lsdException w:name="index 2" w:semiHidden="1" w:unhideWhenUsed="1"/>
     <w:lsdException w:name="index 3" w:semiHidden="1" w:unhideWhenUsed="1"/>
@@ -1317,22 +1283,22 @@
     <w:lsdException w:name="index 7" w:semiHidden="1" w:unhideWhenUsed="1"/>
     <w:lsdException w:name="index 8" w:semiHidden="1" w:unhideWhenUsed="1"/>
     <w:lsdException w:name="index 9" w:semiHidden="1" w:unhideWhenUsed="1"/>
-    <w:lsdException w:name="toc 1" w:uiPriority="39" w:semiHidden="1" w:unhideWhenUsed="1"/>
-    <w:lsdException w:name="toc 2" w:uiPriority="39" w:semiHidden="1" w:unhideWhenUsed="1"/>
-    <w:lsdException w:name="toc 3" w:uiPriority="39" w:semiHidden="1" w:unhideWhenUsed="1"/>
-    <w:lsdException w:name="toc 4" w:uiPriority="39" w:semiHidden="1" w:unhideWhenUsed="1"/>
-    <w:lsdException w:name="toc 5" w:uiPriority="39" w:semiHidden="1" w:unhideWhenUsed="1"/>
-    <w:lsdException w:name="toc 6" w:uiPriority="39" w:semiHidden="1" w:unhideWhenUsed="1"/>
-    <w:lsdException w:name="toc 7" w:uiPriority="39" w:semiHidden="1" w:unhideWhenUsed="1"/>
-    <w:lsdException w:name="toc 8" w:uiPriority="39" w:semiHidden="1" w:unhideWhenUsed="1"/>
-    <w:lsdException w:name="toc 9" w:uiPriority="39" w:semiHidden="1" w:unhideWhenUsed="1"/>
+    <w:lsdException w:name="toc 1" w:semiHidden="1" w:uiPriority="39" w:unhideWhenUsed="1"/>
+    <w:lsdException w:name="toc 2" w:semiHidden="1" w:uiPriority="39" w:unhideWhenUsed="1"/>
+    <w:lsdException w:name="toc 3" w:semiHidden="1" w:uiPriority="39" w:unhideWhenUsed="1"/>
+    <w:lsdException w:name="toc 4" w:semiHidden="1" w:uiPriority="39" w:unhideWhenUsed="1"/>
+    <w:lsdException w:name="toc 5" w:semiHidden="1" w:uiPriority="39" w:unhideWhenUsed="1"/>
+    <w:lsdException w:name="toc 6" w:semiHidden="1" w:uiPriority="39" w:unhideWhenUsed="1"/>
+    <w:lsdException w:name="toc 7" w:semiHidden="1" w:uiPriority="39" w:unhideWhenUsed="1"/>
+    <w:lsdException w:name="toc 8" w:semiHidden="1" w:uiPriority="39" w:unhideWhenUsed="1"/>
+    <w:lsdException w:name="toc 9" w:semiHidden="1" w:uiPriority="39" w:unhideWhenUsed="1"/>
     <w:lsdException w:name="Normal Indent" w:semiHidden="1" w:unhideWhenUsed="1"/>
     <w:lsdException w:name="footnote text" w:semiHidden="1" w:unhideWhenUsed="1"/>
     <w:lsdException w:name="annotation text" w:semiHidden="1" w:unhideWhenUsed="1"/>
     <w:lsdException w:name="header" w:semiHidden="1" w:unhideWhenUsed="1"/>
     <w:lsdException w:name="footer" w:semiHidden="1" w:unhideWhenUsed="1"/>
     <w:lsdException w:name="index heading" w:semiHidden="1" w:unhideWhenUsed="1"/>
-    <w:lsdException w:name="caption" w:uiPriority="35" w:semiHidden="1" w:unhideWhenUsed="1" w:qFormat="1"/>
+    <w:lsdException w:name="caption" w:semiHidden="1" w:uiPriority="35" w:unhideWhenUsed="1" w:qFormat="1"/>
     <w:lsdException w:name="table of figures" w:semiHidden="1" w:unhideWhenUsed="1"/>
     <w:lsdException w:name="envelope address" w:semiHidden="1" w:unhideWhenUsed="1"/>
     <w:lsdException w:name="envelope return" w:semiHidden="1" w:unhideWhenUsed="1"/>
@@ -1363,7 +1329,7 @@
     <w:lsdException w:name="Title" w:uiPriority="10" w:qFormat="1"/>
     <w:lsdException w:name="Closing" w:semiHidden="1" w:unhideWhenUsed="1"/>
     <w:lsdException w:name="Signature" w:semiHidden="1" w:unhideWhenUsed="1"/>
-    <w:lsdException w:name="Default Paragraph Font" w:uiPriority="1" w:semiHidden="1" w:unhideWhenUsed="1"/>
+    <w:lsdException w:name="Default Paragraph Font" w:semiHidden="1" w:uiPriority="1" w:unhideWhenUsed="1"/>
     <w:lsdException w:name="Body Text" w:semiHidden="1" w:unhideWhenUsed="1"/>
     <w:lsdException w:name="Body Text Indent" w:semiHidden="1" w:unhideWhenUsed="1"/>
     <w:lsdException w:name="List Continue" w:semiHidden="1" w:unhideWhenUsed="1"/>
@@ -1563,8 +1529,8 @@
     <w:lsdException w:name="Subtle Reference" w:uiPriority="31" w:qFormat="1"/>
     <w:lsdException w:name="Intense Reference" w:uiPriority="32" w:qFormat="1"/>
     <w:lsdException w:name="Book Title" w:uiPriority="33" w:qFormat="1"/>
-    <w:lsdException w:name="Bibliography" w:uiPriority="37" w:semiHidden="1" w:unhideWhenUsed="1"/>
-    <w:lsdException w:name="TOC Heading" w:uiPriority="39" w:semiHidden="1" w:unhideWhenUsed="1" w:qFormat="1"/>
+    <w:lsdException w:name="Bibliography" w:semiHidden="1" w:uiPriority="37" w:unhideWhenUsed="1"/>
+    <w:lsdException w:name="TOC Heading" w:semiHidden="1" w:uiPriority="39" w:unhideWhenUsed="1" w:qFormat="1"/>
     <w:lsdException w:name="Plain Table 1" w:uiPriority="41"/>
     <w:lsdException w:name="Plain Table 2" w:uiPriority="42"/>
     <w:lsdException w:name="Plain Table 3" w:uiPriority="43"/>
@@ -1675,7 +1641,7 @@
     <w:lsdException w:name="Unresolved Mention" w:semiHidden="1" w:unhideWhenUsed="1"/>
     <w:lsdException w:name="Smart Link" w:semiHidden="1" w:unhideWhenUsed="1"/>
   </w:latentStyles>
-  <w:style w:type="paragraph" w:styleId="Normal" w:default="1">
+  <w:style w:type="paragraph" w:default="1" w:styleId="Normal">
     <w:name w:val="Normal"/>
     <w:qFormat/>
   </w:style>
@@ -1694,7 +1660,7 @@
       <w:outlineLvl w:val="0"/>
     </w:pPr>
     <w:rPr>
-      <w:rFonts w:asciiTheme="majorHAnsi" w:hAnsiTheme="majorHAnsi" w:eastAsiaTheme="majorEastAsia" w:cstheme="majorBidi"/>
+      <w:rFonts w:asciiTheme="majorHAnsi" w:eastAsiaTheme="majorEastAsia" w:hAnsiTheme="majorHAnsi" w:cstheme="majorBidi"/>
       <w:color w:val="0F4761" w:themeColor="accent1" w:themeShade="BF"/>
       <w:sz w:val="40"/>
       <w:szCs w:val="40"/>
@@ -1717,7 +1683,7 @@
       <w:outlineLvl w:val="1"/>
     </w:pPr>
     <w:rPr>
-      <w:rFonts w:asciiTheme="majorHAnsi" w:hAnsiTheme="majorHAnsi" w:eastAsiaTheme="majorEastAsia" w:cstheme="majorBidi"/>
+      <w:rFonts w:asciiTheme="majorHAnsi" w:eastAsiaTheme="majorEastAsia" w:hAnsiTheme="majorHAnsi" w:cstheme="majorBidi"/>
       <w:color w:val="0F4761" w:themeColor="accent1" w:themeShade="BF"/>
       <w:sz w:val="32"/>
       <w:szCs w:val="32"/>
@@ -1878,12 +1844,13 @@
       <w:color w:val="272727" w:themeColor="text1" w:themeTint="D8"/>
     </w:rPr>
   </w:style>
-  <w:style w:type="character" w:styleId="DefaultParagraphFont" w:default="1">
+  <w:style w:type="character" w:default="1" w:styleId="DefaultParagraphFont">
     <w:name w:val="Default Paragraph Font"/>
     <w:uiPriority w:val="1"/>
+    <w:semiHidden/>
     <w:unhideWhenUsed/>
   </w:style>
-  <w:style w:type="table" w:styleId="TableNormal" w:default="1">
+  <w:style w:type="table" w:default="1" w:styleId="TableNormal">
     <w:name w:val="Normal Table"/>
     <w:uiPriority w:val="99"/>
     <w:semiHidden/>
@@ -1898,26 +1865,26 @@
       </w:tblCellMar>
     </w:tblPr>
   </w:style>
-  <w:style w:type="numbering" w:styleId="NoList" w:default="1">
+  <w:style w:type="numbering" w:default="1" w:styleId="NoList">
     <w:name w:val="No List"/>
     <w:uiPriority w:val="99"/>
     <w:semiHidden/>
     <w:unhideWhenUsed/>
   </w:style>
-  <w:style w:type="character" w:styleId="Heading1Char" w:customStyle="1">
+  <w:style w:type="character" w:customStyle="1" w:styleId="Heading1Char">
     <w:name w:val="Heading 1 Char"/>
     <w:basedOn w:val="DefaultParagraphFont"/>
     <w:link w:val="Heading1"/>
     <w:uiPriority w:val="9"/>
     <w:rsid w:val="00E7247C"/>
     <w:rPr>
-      <w:rFonts w:asciiTheme="majorHAnsi" w:hAnsiTheme="majorHAnsi" w:eastAsiaTheme="majorEastAsia" w:cstheme="majorBidi"/>
+      <w:rFonts w:asciiTheme="majorHAnsi" w:eastAsiaTheme="majorEastAsia" w:hAnsiTheme="majorHAnsi" w:cstheme="majorBidi"/>
       <w:color w:val="0F4761" w:themeColor="accent1" w:themeShade="BF"/>
       <w:sz w:val="40"/>
       <w:szCs w:val="40"/>
     </w:rPr>
   </w:style>
-  <w:style w:type="character" w:styleId="Heading2Char" w:customStyle="1">
+  <w:style w:type="character" w:customStyle="1" w:styleId="Heading2Char">
     <w:name w:val="Heading 2 Char"/>
     <w:basedOn w:val="DefaultParagraphFont"/>
     <w:link w:val="Heading2"/>
@@ -1925,13 +1892,13 @@
     <w:semiHidden/>
     <w:rsid w:val="00E7247C"/>
     <w:rPr>
-      <w:rFonts w:asciiTheme="majorHAnsi" w:hAnsiTheme="majorHAnsi" w:eastAsiaTheme="majorEastAsia" w:cstheme="majorBidi"/>
+      <w:rFonts w:asciiTheme="majorHAnsi" w:eastAsiaTheme="majorEastAsia" w:hAnsiTheme="majorHAnsi" w:cstheme="majorBidi"/>
       <w:color w:val="0F4761" w:themeColor="accent1" w:themeShade="BF"/>
       <w:sz w:val="32"/>
       <w:szCs w:val="32"/>
     </w:rPr>
   </w:style>
-  <w:style w:type="character" w:styleId="Heading3Char" w:customStyle="1">
+  <w:style w:type="character" w:customStyle="1" w:styleId="Heading3Char">
     <w:name w:val="Heading 3 Char"/>
     <w:basedOn w:val="DefaultParagraphFont"/>
     <w:link w:val="Heading3"/>
@@ -1945,7 +1912,7 @@
       <w:szCs w:val="28"/>
     </w:rPr>
   </w:style>
-  <w:style w:type="character" w:styleId="Heading4Char" w:customStyle="1">
+  <w:style w:type="character" w:customStyle="1" w:styleId="Heading4Char">
     <w:name w:val="Heading 4 Char"/>
     <w:basedOn w:val="DefaultParagraphFont"/>
     <w:link w:val="Heading4"/>
@@ -1959,7 +1926,7 @@
       <w:color w:val="0F4761" w:themeColor="accent1" w:themeShade="BF"/>
     </w:rPr>
   </w:style>
-  <w:style w:type="character" w:styleId="Heading5Char" w:customStyle="1">
+  <w:style w:type="character" w:customStyle="1" w:styleId="Heading5Char">
     <w:name w:val="Heading 5 Char"/>
     <w:basedOn w:val="DefaultParagraphFont"/>
     <w:link w:val="Heading5"/>
@@ -1971,7 +1938,7 @@
       <w:color w:val="0F4761" w:themeColor="accent1" w:themeShade="BF"/>
     </w:rPr>
   </w:style>
-  <w:style w:type="character" w:styleId="Heading6Char" w:customStyle="1">
+  <w:style w:type="character" w:customStyle="1" w:styleId="Heading6Char">
     <w:name w:val="Heading 6 Char"/>
     <w:basedOn w:val="DefaultParagraphFont"/>
     <w:link w:val="Heading6"/>
@@ -1985,7 +1952,7 @@
       <w:color w:val="595959" w:themeColor="text1" w:themeTint="A6"/>
     </w:rPr>
   </w:style>
-  <w:style w:type="character" w:styleId="Heading7Char" w:customStyle="1">
+  <w:style w:type="character" w:customStyle="1" w:styleId="Heading7Char">
     <w:name w:val="Heading 7 Char"/>
     <w:basedOn w:val="DefaultParagraphFont"/>
     <w:link w:val="Heading7"/>
@@ -1997,7 +1964,7 @@
       <w:color w:val="595959" w:themeColor="text1" w:themeTint="A6"/>
     </w:rPr>
   </w:style>
-  <w:style w:type="character" w:styleId="Heading8Char" w:customStyle="1">
+  <w:style w:type="character" w:customStyle="1" w:styleId="Heading8Char">
     <w:name w:val="Heading 8 Char"/>
     <w:basedOn w:val="DefaultParagraphFont"/>
     <w:link w:val="Heading8"/>
@@ -2011,7 +1978,7 @@
       <w:color w:val="272727" w:themeColor="text1" w:themeTint="D8"/>
     </w:rPr>
   </w:style>
-  <w:style w:type="character" w:styleId="Heading9Char" w:customStyle="1">
+  <w:style w:type="character" w:customStyle="1" w:styleId="Heading9Char">
     <w:name w:val="Heading 9 Char"/>
     <w:basedOn w:val="DefaultParagraphFont"/>
     <w:link w:val="Heading9"/>
@@ -2036,21 +2003,21 @@
       <w:contextualSpacing/>
     </w:pPr>
     <w:rPr>
-      <w:rFonts w:asciiTheme="majorHAnsi" w:hAnsiTheme="majorHAnsi" w:eastAsiaTheme="majorEastAsia" w:cstheme="majorBidi"/>
+      <w:rFonts w:asciiTheme="majorHAnsi" w:eastAsiaTheme="majorEastAsia" w:hAnsiTheme="majorHAnsi" w:cstheme="majorBidi"/>
       <w:spacing w:val="-10"/>
       <w:kern w:val="28"/>
       <w:sz w:val="56"/>
       <w:szCs w:val="56"/>
     </w:rPr>
   </w:style>
-  <w:style w:type="character" w:styleId="TitleChar" w:customStyle="1">
+  <w:style w:type="character" w:customStyle="1" w:styleId="TitleChar">
     <w:name w:val="Title Char"/>
     <w:basedOn w:val="DefaultParagraphFont"/>
     <w:link w:val="Title"/>
     <w:uiPriority w:val="10"/>
     <w:rsid w:val="00E7247C"/>
     <w:rPr>
-      <w:rFonts w:asciiTheme="majorHAnsi" w:hAnsiTheme="majorHAnsi" w:eastAsiaTheme="majorEastAsia" w:cstheme="majorBidi"/>
+      <w:rFonts w:asciiTheme="majorHAnsi" w:eastAsiaTheme="majorEastAsia" w:hAnsiTheme="majorHAnsi" w:cstheme="majorBidi"/>
       <w:spacing w:val="-10"/>
       <w:kern w:val="28"/>
       <w:sz w:val="56"/>
@@ -2078,7 +2045,7 @@
       <w:szCs w:val="28"/>
     </w:rPr>
   </w:style>
-  <w:style w:type="character" w:styleId="SubtitleChar" w:customStyle="1">
+  <w:style w:type="character" w:customStyle="1" w:styleId="SubtitleChar">
     <w:name w:val="Subtitle Char"/>
     <w:basedOn w:val="DefaultParagraphFont"/>
     <w:link w:val="Subtitle"/>
@@ -2110,7 +2077,7 @@
       <w:color w:val="404040" w:themeColor="text1" w:themeTint="BF"/>
     </w:rPr>
   </w:style>
-  <w:style w:type="character" w:styleId="QuoteChar" w:customStyle="1">
+  <w:style w:type="character" w:customStyle="1" w:styleId="QuoteChar">
     <w:name w:val="Quote Char"/>
     <w:basedOn w:val="DefaultParagraphFont"/>
     <w:link w:val="Quote"/>
@@ -2155,8 +2122,8 @@
     <w:rsid w:val="00E7247C"/>
     <w:pPr>
       <w:pBdr>
-        <w:top w:val="single" w:color="0F4761" w:themeColor="accent1" w:themeShade="BF" w:sz="4" w:space="10"/>
-        <w:bottom w:val="single" w:color="0F4761" w:themeColor="accent1" w:themeShade="BF" w:sz="4" w:space="10"/>
+        <w:top w:val="single" w:sz="4" w:space="10" w:color="0F4761" w:themeColor="accent1" w:themeShade="BF"/>
+        <w:bottom w:val="single" w:sz="4" w:space="10" w:color="0F4761" w:themeColor="accent1" w:themeShade="BF"/>
       </w:pBdr>
       <w:spacing w:before="360" w:after="360"/>
       <w:ind w:left="864" w:right="864"/>
@@ -2168,7 +2135,7 @@
       <w:color w:val="0F4761" w:themeColor="accent1" w:themeShade="BF"/>
     </w:rPr>
   </w:style>
-  <w:style w:type="character" w:styleId="IntenseQuoteChar" w:customStyle="1">
+  <w:style w:type="character" w:customStyle="1" w:styleId="IntenseQuoteChar">
     <w:name w:val="Intense Quote Char"/>
     <w:basedOn w:val="DefaultParagraphFont"/>
     <w:link w:val="IntenseQuote"/>

</xml_diff>